<commit_message>
updated resume with hebrew equivalents
</commit_message>
<xml_diff>
--- a/adam-steinberger-resume.docx
+++ b/adam-steinberger-resume.docx
@@ -7,7 +7,7 @@
         <w:spacing w:after="0" w:line="228" w:lineRule="auto"/>
         <w:jc w:val="center"/>
         <w:rPr>
-          <w:rFonts w:ascii="Gill Sans MT" w:hAnsi="Gill Sans MT"/>
+          <w:rFonts w:ascii="Gill Sans MT" w:eastAsia="Calibri" w:hAnsi="Gill Sans MT"/>
           <w:sz w:val="40"/>
           <w:szCs w:val="32"/>
         </w:rPr>
@@ -150,8 +150,16 @@
           <w:rPr>
             <w:rStyle w:val="Hyperlink"/>
           </w:rPr>
-          <w:t>linkedin.com/in/steinbergeradam</w:t>
+          <w:t>linkedin.com/in/</w:t>
         </w:r>
+        <w:proofErr w:type="spellStart"/>
+        <w:r>
+          <w:rPr>
+            <w:rStyle w:val="Hyperlink"/>
+          </w:rPr>
+          <w:t>realadammatthew</w:t>
+        </w:r>
+        <w:proofErr w:type="spellEnd"/>
       </w:hyperlink>
       <w:r>
         <w:t xml:space="preserve"> | </w:t>
@@ -161,8 +169,16 @@
           <w:rPr>
             <w:rStyle w:val="Hyperlink"/>
           </w:rPr>
-          <w:t>github.com/adamsteinberger</w:t>
+          <w:t>github.com/</w:t>
         </w:r>
+        <w:proofErr w:type="spellStart"/>
+        <w:r>
+          <w:rPr>
+            <w:rStyle w:val="Hyperlink"/>
+          </w:rPr>
+          <w:t>realadammatthew</w:t>
+        </w:r>
+        <w:proofErr w:type="spellEnd"/>
       </w:hyperlink>
     </w:p>
     <w:p>
@@ -357,7 +373,27 @@
           <w:sz w:val="20"/>
           <w:szCs w:val="20"/>
         </w:rPr>
-        <w:t>Python, JavaScript, .NET, NestJS, and cloud-based solutions</w:t>
+        <w:t xml:space="preserve">Python, JavaScript, .NET, </w:t>
+      </w:r>
+      <w:proofErr w:type="spellStart"/>
+      <w:r>
+        <w:rPr>
+          <w:rFonts w:ascii="Gill Sans MT" w:hAnsi="Gill Sans MT"/>
+          <w:iCs/>
+          <w:sz w:val="20"/>
+          <w:szCs w:val="20"/>
+        </w:rPr>
+        <w:t>NestJS</w:t>
+      </w:r>
+      <w:proofErr w:type="spellEnd"/>
+      <w:r>
+        <w:rPr>
+          <w:rFonts w:ascii="Gill Sans MT" w:hAnsi="Gill Sans MT"/>
+          <w:iCs/>
+          <w:sz w:val="20"/>
+          <w:szCs w:val="20"/>
+        </w:rPr>
+        <w:t>, and cloud-based solutions</w:t>
       </w:r>
       <w:r>
         <w:rPr>
@@ -543,14 +579,34 @@
         </w:rPr>
         <w:t xml:space="preserve">, </w:t>
       </w:r>
-      <w:r>
-        <w:rPr>
-          <w:rFonts w:ascii="Gill Sans MT" w:hAnsi="Gill Sans MT"/>
-          <w:sz w:val="20"/>
-          <w:szCs w:val="20"/>
-        </w:rPr>
-        <w:t>NestJS, Flask, WebAPI</w:t>
-      </w:r>
+      <w:proofErr w:type="spellStart"/>
+      <w:r>
+        <w:rPr>
+          <w:rFonts w:ascii="Gill Sans MT" w:hAnsi="Gill Sans MT"/>
+          <w:sz w:val="20"/>
+          <w:szCs w:val="20"/>
+        </w:rPr>
+        <w:t>NestJS</w:t>
+      </w:r>
+      <w:proofErr w:type="spellEnd"/>
+      <w:r>
+        <w:rPr>
+          <w:rFonts w:ascii="Gill Sans MT" w:hAnsi="Gill Sans MT"/>
+          <w:sz w:val="20"/>
+          <w:szCs w:val="20"/>
+        </w:rPr>
+        <w:t xml:space="preserve">, Flask, </w:t>
+      </w:r>
+      <w:proofErr w:type="spellStart"/>
+      <w:r>
+        <w:rPr>
+          <w:rFonts w:ascii="Gill Sans MT" w:hAnsi="Gill Sans MT"/>
+          <w:sz w:val="20"/>
+          <w:szCs w:val="20"/>
+        </w:rPr>
+        <w:t>WebAPI</w:t>
+      </w:r>
+      <w:proofErr w:type="spellEnd"/>
     </w:p>
     <w:p>
       <w:pPr>
@@ -898,6 +954,7 @@
           <w:szCs w:val="20"/>
         </w:rPr>
       </w:pPr>
+      <w:proofErr w:type="spellStart"/>
       <w:r>
         <w:rPr>
           <w:rFonts w:ascii="Gill Sans MT" w:hAnsi="Gill Sans MT"/>
@@ -906,7 +963,18 @@
           <w:szCs w:val="20"/>
           <w:u w:val="single"/>
         </w:rPr>
-        <w:t>Lima One Capital</w:t>
+        <w:t>Humbleberger</w:t>
+      </w:r>
+      <w:proofErr w:type="spellEnd"/>
+      <w:r>
+        <w:rPr>
+          <w:rFonts w:ascii="Gill Sans MT" w:hAnsi="Gill Sans MT"/>
+          <w:b/>
+          <w:sz w:val="20"/>
+          <w:szCs w:val="20"/>
+          <w:u w:val="single"/>
+        </w:rPr>
+        <w:t xml:space="preserve"> Software</w:t>
       </w:r>
       <w:r>
         <w:rPr>
@@ -923,25 +991,7 @@
           <w:sz w:val="20"/>
           <w:szCs w:val="20"/>
         </w:rPr>
-        <w:t>Greenville</w:t>
-      </w:r>
-      <w:r>
-        <w:rPr>
-          <w:rFonts w:ascii="Gill Sans MT" w:hAnsi="Gill Sans MT"/>
-          <w:b/>
-          <w:sz w:val="20"/>
-          <w:szCs w:val="20"/>
-        </w:rPr>
-        <w:t xml:space="preserve">, </w:t>
-      </w:r>
-      <w:r>
-        <w:rPr>
-          <w:rFonts w:ascii="Gill Sans MT" w:hAnsi="Gill Sans MT"/>
-          <w:b/>
-          <w:sz w:val="20"/>
-          <w:szCs w:val="20"/>
-        </w:rPr>
-        <w:t>SC</w:t>
+        <w:t>Wake Forest, NC</w:t>
       </w:r>
     </w:p>
     <w:p>
@@ -1003,6 +1053,24 @@
           <w:sz w:val="20"/>
           <w:szCs w:val="20"/>
         </w:rPr>
+        <w:t>3</w:t>
+      </w:r>
+      <w:r>
+        <w:rPr>
+          <w:rFonts w:ascii="Gill Sans MT" w:hAnsi="Gill Sans MT"/>
+          <w:b/>
+          <w:sz w:val="20"/>
+          <w:szCs w:val="20"/>
+        </w:rPr>
+        <w:t>/202</w:t>
+      </w:r>
+      <w:r>
+        <w:rPr>
+          <w:rFonts w:ascii="Gill Sans MT" w:hAnsi="Gill Sans MT"/>
+          <w:b/>
+          <w:sz w:val="20"/>
+          <w:szCs w:val="20"/>
+        </w:rPr>
         <w:t>5</w:t>
       </w:r>
       <w:r>
@@ -1012,25 +1080,16 @@
           <w:sz w:val="20"/>
           <w:szCs w:val="20"/>
         </w:rPr>
-        <w:t>/202</w:t>
-      </w:r>
-      <w:r>
-        <w:rPr>
-          <w:rFonts w:ascii="Gill Sans MT" w:hAnsi="Gill Sans MT"/>
-          <w:b/>
-          <w:sz w:val="20"/>
-          <w:szCs w:val="20"/>
-        </w:rPr>
-        <w:t>3</w:t>
-      </w:r>
-      <w:r>
-        <w:rPr>
-          <w:rFonts w:ascii="Gill Sans MT" w:hAnsi="Gill Sans MT"/>
-          <w:b/>
-          <w:sz w:val="20"/>
-          <w:szCs w:val="20"/>
-        </w:rPr>
-        <w:t>-Present</w:t>
+        <w:t>-</w:t>
+      </w:r>
+      <w:r>
+        <w:rPr>
+          <w:rFonts w:ascii="Gill Sans MT" w:hAnsi="Gill Sans MT"/>
+          <w:b/>
+          <w:sz w:val="20"/>
+          <w:szCs w:val="20"/>
+        </w:rPr>
+        <w:t>Present</w:t>
       </w:r>
     </w:p>
     <w:p>
@@ -1053,7 +1112,187 @@
           <w:sz w:val="20"/>
           <w:szCs w:val="20"/>
         </w:rPr>
-        <w:t>Led Python &amp; JavaScript integrations using APIs, Webhooks, and Job Schedulers.</w:t>
+        <w:t>Software Consulting Firm in Wake Forest, NC, USA</w:t>
+      </w:r>
+      <w:r>
+        <w:rPr>
+          <w:rFonts w:ascii="Gill Sans MT" w:hAnsi="Gill Sans MT"/>
+          <w:sz w:val="20"/>
+          <w:szCs w:val="20"/>
+        </w:rPr>
+        <w:t>.</w:t>
+      </w:r>
+    </w:p>
+    <w:p>
+      <w:pPr>
+        <w:tabs>
+          <w:tab w:val="right" w:pos="10800"/>
+        </w:tabs>
+        <w:spacing w:after="0" w:line="228" w:lineRule="auto"/>
+        <w:rPr>
+          <w:rFonts w:ascii="Gill Sans MT" w:hAnsi="Gill Sans MT"/>
+          <w:b/>
+          <w:sz w:val="20"/>
+          <w:szCs w:val="20"/>
+          <w:u w:val="single"/>
+        </w:rPr>
+      </w:pPr>
+    </w:p>
+    <w:p>
+      <w:pPr>
+        <w:tabs>
+          <w:tab w:val="right" w:pos="10800"/>
+        </w:tabs>
+        <w:spacing w:after="0" w:line="228" w:lineRule="auto"/>
+        <w:rPr>
+          <w:rFonts w:ascii="Gill Sans MT" w:hAnsi="Gill Sans MT"/>
+          <w:b/>
+          <w:sz w:val="20"/>
+          <w:szCs w:val="20"/>
+        </w:rPr>
+      </w:pPr>
+      <w:r>
+        <w:rPr>
+          <w:rFonts w:ascii="Gill Sans MT" w:hAnsi="Gill Sans MT"/>
+          <w:b/>
+          <w:sz w:val="20"/>
+          <w:szCs w:val="20"/>
+          <w:u w:val="single"/>
+        </w:rPr>
+        <w:t>Lima One Capital</w:t>
+      </w:r>
+      <w:r>
+        <w:rPr>
+          <w:rFonts w:ascii="Gill Sans MT" w:hAnsi="Gill Sans MT"/>
+          <w:sz w:val="20"/>
+          <w:szCs w:val="20"/>
+        </w:rPr>
+        <w:tab/>
+      </w:r>
+      <w:r>
+        <w:rPr>
+          <w:rFonts w:ascii="Gill Sans MT" w:hAnsi="Gill Sans MT"/>
+          <w:b/>
+          <w:sz w:val="20"/>
+          <w:szCs w:val="20"/>
+        </w:rPr>
+        <w:t>Greenville</w:t>
+      </w:r>
+      <w:r>
+        <w:rPr>
+          <w:rFonts w:ascii="Gill Sans MT" w:hAnsi="Gill Sans MT"/>
+          <w:b/>
+          <w:sz w:val="20"/>
+          <w:szCs w:val="20"/>
+        </w:rPr>
+        <w:t xml:space="preserve">, </w:t>
+      </w:r>
+      <w:r>
+        <w:rPr>
+          <w:rFonts w:ascii="Gill Sans MT" w:hAnsi="Gill Sans MT"/>
+          <w:b/>
+          <w:sz w:val="20"/>
+          <w:szCs w:val="20"/>
+        </w:rPr>
+        <w:t>SC</w:t>
+      </w:r>
+    </w:p>
+    <w:p>
+      <w:pPr>
+        <w:shd w:val="clear" w:color="auto" w:fill="F2F2F2" w:themeFill="background1" w:themeFillShade="F2"/>
+        <w:tabs>
+          <w:tab w:val="right" w:pos="8928"/>
+          <w:tab w:val="right" w:pos="11520"/>
+        </w:tabs>
+        <w:spacing w:after="80" w:line="228" w:lineRule="auto"/>
+        <w:rPr>
+          <w:rFonts w:ascii="Gill Sans MT" w:hAnsi="Gill Sans MT"/>
+          <w:b/>
+          <w:sz w:val="20"/>
+          <w:szCs w:val="20"/>
+        </w:rPr>
+      </w:pPr>
+      <w:r>
+        <w:rPr>
+          <w:rFonts w:ascii="Gill Sans MT" w:hAnsi="Gill Sans MT"/>
+          <w:b/>
+          <w:sz w:val="20"/>
+          <w:szCs w:val="20"/>
+        </w:rPr>
+        <w:t>Senior</w:t>
+      </w:r>
+      <w:r>
+        <w:rPr>
+          <w:rFonts w:ascii="Gill Sans MT" w:hAnsi="Gill Sans MT"/>
+          <w:b/>
+          <w:sz w:val="20"/>
+          <w:szCs w:val="20"/>
+        </w:rPr>
+        <w:t xml:space="preserve"> Software Engineer </w:t>
+      </w:r>
+      <w:r>
+        <w:rPr>
+          <w:rFonts w:ascii="Gill Sans MT" w:hAnsi="Gill Sans MT"/>
+          <w:b/>
+          <w:sz w:val="20"/>
+          <w:szCs w:val="20"/>
+        </w:rPr>
+        <w:tab/>
+      </w:r>
+      <w:r>
+        <w:rPr>
+          <w:rFonts w:ascii="Gill Sans MT" w:hAnsi="Gill Sans MT"/>
+          <w:b/>
+          <w:sz w:val="20"/>
+          <w:szCs w:val="20"/>
+        </w:rPr>
+        <w:tab/>
+        <w:t>0</w:t>
+      </w:r>
+      <w:r>
+        <w:rPr>
+          <w:rFonts w:ascii="Gill Sans MT" w:hAnsi="Gill Sans MT"/>
+          <w:b/>
+          <w:sz w:val="20"/>
+          <w:szCs w:val="20"/>
+        </w:rPr>
+        <w:t>5</w:t>
+      </w:r>
+      <w:r>
+        <w:rPr>
+          <w:rFonts w:ascii="Gill Sans MT" w:hAnsi="Gill Sans MT"/>
+          <w:b/>
+          <w:sz w:val="20"/>
+          <w:szCs w:val="20"/>
+        </w:rPr>
+        <w:t>/202</w:t>
+      </w:r>
+      <w:r>
+        <w:rPr>
+          <w:rFonts w:ascii="Gill Sans MT" w:hAnsi="Gill Sans MT"/>
+          <w:b/>
+          <w:sz w:val="20"/>
+          <w:szCs w:val="20"/>
+        </w:rPr>
+        <w:t>3</w:t>
+      </w:r>
+      <w:r>
+        <w:rPr>
+          <w:rFonts w:ascii="Gill Sans MT" w:hAnsi="Gill Sans MT"/>
+          <w:b/>
+          <w:sz w:val="20"/>
+          <w:szCs w:val="20"/>
+        </w:rPr>
+        <w:t>-</w:t>
+      </w:r>
+      <w:r>
+        <w:rPr>
+          <w:rFonts w:ascii="Gill Sans MT" w:hAnsi="Gill Sans MT"/>
+          <w:b/>
+          <w:sz w:val="20"/>
+          <w:szCs w:val="20"/>
+        </w:rPr>
+        <w:t>02/2025</w:t>
       </w:r>
     </w:p>
     <w:p>
@@ -1076,7 +1315,7 @@
           <w:sz w:val="20"/>
           <w:szCs w:val="20"/>
         </w:rPr>
-        <w:t>Redesigned an enterprise software suite with NestJS microservices (gRPC, REST) &amp; PostgreSQL.</w:t>
+        <w:t>Led Python &amp; JavaScript integrations using APIs, Webhooks, and Job Schedulers.</w:t>
       </w:r>
     </w:p>
     <w:p>
@@ -1099,7 +1338,43 @@
           <w:sz w:val="20"/>
           <w:szCs w:val="20"/>
         </w:rPr>
-        <w:t>Migrated legacy Mulesoft APIs to NestJS, improving system efficiency.</w:t>
+        <w:t xml:space="preserve">Redesigned an enterprise software suite with </w:t>
+      </w:r>
+      <w:proofErr w:type="spellStart"/>
+      <w:r>
+        <w:rPr>
+          <w:rFonts w:ascii="Gill Sans MT" w:hAnsi="Gill Sans MT"/>
+          <w:sz w:val="20"/>
+          <w:szCs w:val="20"/>
+        </w:rPr>
+        <w:t>NestJS</w:t>
+      </w:r>
+      <w:proofErr w:type="spellEnd"/>
+      <w:r>
+        <w:rPr>
+          <w:rFonts w:ascii="Gill Sans MT" w:hAnsi="Gill Sans MT"/>
+          <w:sz w:val="20"/>
+          <w:szCs w:val="20"/>
+        </w:rPr>
+        <w:t xml:space="preserve"> microservices (</w:t>
+      </w:r>
+      <w:proofErr w:type="spellStart"/>
+      <w:r>
+        <w:rPr>
+          <w:rFonts w:ascii="Gill Sans MT" w:hAnsi="Gill Sans MT"/>
+          <w:sz w:val="20"/>
+          <w:szCs w:val="20"/>
+        </w:rPr>
+        <w:t>gRPC</w:t>
+      </w:r>
+      <w:proofErr w:type="spellEnd"/>
+      <w:r>
+        <w:rPr>
+          <w:rFonts w:ascii="Gill Sans MT" w:hAnsi="Gill Sans MT"/>
+          <w:sz w:val="20"/>
+          <w:szCs w:val="20"/>
+        </w:rPr>
+        <w:t>, REST) &amp; PostgreSQL.</w:t>
       </w:r>
     </w:p>
     <w:p>
@@ -1122,7 +1397,43 @@
           <w:sz w:val="20"/>
           <w:szCs w:val="20"/>
         </w:rPr>
-        <w:t>Led .NET &amp; ReactJS development for a mortgage broker platform.</w:t>
+        <w:t xml:space="preserve">Migrated legacy </w:t>
+      </w:r>
+      <w:proofErr w:type="spellStart"/>
+      <w:r>
+        <w:rPr>
+          <w:rFonts w:ascii="Gill Sans MT" w:hAnsi="Gill Sans MT"/>
+          <w:sz w:val="20"/>
+          <w:szCs w:val="20"/>
+        </w:rPr>
+        <w:t>Mulesoft</w:t>
+      </w:r>
+      <w:proofErr w:type="spellEnd"/>
+      <w:r>
+        <w:rPr>
+          <w:rFonts w:ascii="Gill Sans MT" w:hAnsi="Gill Sans MT"/>
+          <w:sz w:val="20"/>
+          <w:szCs w:val="20"/>
+        </w:rPr>
+        <w:t xml:space="preserve"> APIs to </w:t>
+      </w:r>
+      <w:proofErr w:type="spellStart"/>
+      <w:r>
+        <w:rPr>
+          <w:rFonts w:ascii="Gill Sans MT" w:hAnsi="Gill Sans MT"/>
+          <w:sz w:val="20"/>
+          <w:szCs w:val="20"/>
+        </w:rPr>
+        <w:t>NestJS</w:t>
+      </w:r>
+      <w:proofErr w:type="spellEnd"/>
+      <w:r>
+        <w:rPr>
+          <w:rFonts w:ascii="Gill Sans MT" w:hAnsi="Gill Sans MT"/>
+          <w:sz w:val="20"/>
+          <w:szCs w:val="20"/>
+        </w:rPr>
+        <w:t>, improving system efficiency.</w:t>
       </w:r>
     </w:p>
     <w:p>
@@ -1145,7 +1456,7 @@
           <w:sz w:val="20"/>
           <w:szCs w:val="20"/>
         </w:rPr>
-        <w:t>Built HubSpot Sync, automating SharePoint &amp; HubSpot data flow for marketing.</w:t>
+        <w:t>Led .NET &amp; ReactJS development for a mortgage broker platform.</w:t>
       </w:r>
     </w:p>
     <w:p>
@@ -1168,7 +1479,7 @@
           <w:sz w:val="20"/>
           <w:szCs w:val="20"/>
         </w:rPr>
-        <w:t>Developed Elphi ETL, capturing &amp; tracking Elphi data in Snowflake via webhook.</w:t>
+        <w:t>Built HubSpot Sync, automating SharePoint &amp; HubSpot data flow for marketing.</w:t>
       </w:r>
     </w:p>
     <w:p>
@@ -1191,7 +1502,43 @@
           <w:sz w:val="20"/>
           <w:szCs w:val="20"/>
         </w:rPr>
-        <w:t>Integrated HouseCanary property data into Snowflake for real-time accessibility.</w:t>
+        <w:t xml:space="preserve">Developed </w:t>
+      </w:r>
+      <w:proofErr w:type="spellStart"/>
+      <w:r>
+        <w:rPr>
+          <w:rFonts w:ascii="Gill Sans MT" w:hAnsi="Gill Sans MT"/>
+          <w:sz w:val="20"/>
+          <w:szCs w:val="20"/>
+        </w:rPr>
+        <w:t>Elphi</w:t>
+      </w:r>
+      <w:proofErr w:type="spellEnd"/>
+      <w:r>
+        <w:rPr>
+          <w:rFonts w:ascii="Gill Sans MT" w:hAnsi="Gill Sans MT"/>
+          <w:sz w:val="20"/>
+          <w:szCs w:val="20"/>
+        </w:rPr>
+        <w:t xml:space="preserve"> ETL, capturing &amp; tracking </w:t>
+      </w:r>
+      <w:proofErr w:type="spellStart"/>
+      <w:r>
+        <w:rPr>
+          <w:rFonts w:ascii="Gill Sans MT" w:hAnsi="Gill Sans MT"/>
+          <w:sz w:val="20"/>
+          <w:szCs w:val="20"/>
+        </w:rPr>
+        <w:t>Elphi</w:t>
+      </w:r>
+      <w:proofErr w:type="spellEnd"/>
+      <w:r>
+        <w:rPr>
+          <w:rFonts w:ascii="Gill Sans MT" w:hAnsi="Gill Sans MT"/>
+          <w:sz w:val="20"/>
+          <w:szCs w:val="20"/>
+        </w:rPr>
+        <w:t xml:space="preserve"> data in Snowflake via webhook.</w:t>
       </w:r>
     </w:p>
     <w:p>
@@ -1214,7 +1561,25 @@
           <w:sz w:val="20"/>
           <w:szCs w:val="20"/>
         </w:rPr>
-        <w:t>Automated Paylocity Sync, logging HR changes into Halo ITSM.</w:t>
+        <w:t xml:space="preserve">Integrated </w:t>
+      </w:r>
+      <w:proofErr w:type="spellStart"/>
+      <w:r>
+        <w:rPr>
+          <w:rFonts w:ascii="Gill Sans MT" w:hAnsi="Gill Sans MT"/>
+          <w:sz w:val="20"/>
+          <w:szCs w:val="20"/>
+        </w:rPr>
+        <w:t>HouseCanary</w:t>
+      </w:r>
+      <w:proofErr w:type="spellEnd"/>
+      <w:r>
+        <w:rPr>
+          <w:rFonts w:ascii="Gill Sans MT" w:hAnsi="Gill Sans MT"/>
+          <w:sz w:val="20"/>
+          <w:szCs w:val="20"/>
+        </w:rPr>
+        <w:t xml:space="preserve"> property data into Snowflake for real-time accessibility.</w:t>
       </w:r>
     </w:p>
     <w:p>
@@ -1237,7 +1602,7 @@
           <w:sz w:val="20"/>
           <w:szCs w:val="20"/>
         </w:rPr>
-        <w:t>Created Snow Portal, a job scheduling system for Snowflake (Alteryx alternative).</w:t>
+        <w:t>Automated Paylocity Sync, logging HR changes into Halo ITSM.</w:t>
       </w:r>
     </w:p>
     <w:p>
@@ -1260,7 +1625,7 @@
           <w:sz w:val="20"/>
           <w:szCs w:val="20"/>
         </w:rPr>
-        <w:t>Designed and implemented PE Microservices, including Nest-based authentication &amp; logging solutions.</w:t>
+        <w:t>Created Snow Portal, a job scheduling system for Snowflake (Alteryx alternative).</w:t>
       </w:r>
     </w:p>
     <w:p>
@@ -1283,7 +1648,7 @@
           <w:sz w:val="20"/>
           <w:szCs w:val="20"/>
         </w:rPr>
-        <w:t>Prototyped the PE Next Web App, a modern Next.js UI for the Pricing Engine.</w:t>
+        <w:t>Designed and implemented PE Microservices, including Nest-based authentication &amp; logging solutions.</w:t>
       </w:r>
     </w:p>
     <w:p>
@@ -1306,7 +1671,7 @@
           <w:sz w:val="20"/>
           <w:szCs w:val="20"/>
         </w:rPr>
-        <w:t>Refactored Salesforce Integration using NestJS for improved reliability.</w:t>
+        <w:t>Prototyped the PE Next Web App, a modern Next.js UI for the Pricing Engine.</w:t>
       </w:r>
     </w:p>
     <w:p>
@@ -1329,7 +1694,25 @@
           <w:sz w:val="20"/>
           <w:szCs w:val="20"/>
         </w:rPr>
-        <w:t>Developed the PE Credco API, generating credit reports within the Pricing Engine.</w:t>
+        <w:t xml:space="preserve">Refactored Salesforce Integration using </w:t>
+      </w:r>
+      <w:proofErr w:type="spellStart"/>
+      <w:r>
+        <w:rPr>
+          <w:rFonts w:ascii="Gill Sans MT" w:hAnsi="Gill Sans MT"/>
+          <w:sz w:val="20"/>
+          <w:szCs w:val="20"/>
+        </w:rPr>
+        <w:t>NestJS</w:t>
+      </w:r>
+      <w:proofErr w:type="spellEnd"/>
+      <w:r>
+        <w:rPr>
+          <w:rFonts w:ascii="Gill Sans MT" w:hAnsi="Gill Sans MT"/>
+          <w:sz w:val="20"/>
+          <w:szCs w:val="20"/>
+        </w:rPr>
+        <w:t xml:space="preserve"> for improved reliability.</w:t>
       </w:r>
     </w:p>
     <w:p>
@@ -1352,7 +1735,7 @@
           <w:sz w:val="20"/>
           <w:szCs w:val="20"/>
         </w:rPr>
-        <w:t>Implemented the PE Nightly Cron &amp; Scheduler, automating database operations.</w:t>
+        <w:t>Developed the PE Credco API, generating credit reports within the Pricing Engine.</w:t>
       </w:r>
     </w:p>
     <w:p>
@@ -1375,1195 +1758,7 @@
           <w:sz w:val="20"/>
           <w:szCs w:val="20"/>
         </w:rPr>
-        <w:t>Explored DBT for Snowflake transformations &amp; version control in a proof of concept.</w:t>
-      </w:r>
-    </w:p>
-    <w:p>
-      <w:pPr>
-        <w:spacing w:after="0" w:line="228" w:lineRule="auto"/>
-        <w:rPr>
-          <w:rFonts w:ascii="Gill Sans MT" w:hAnsi="Gill Sans MT"/>
-          <w:sz w:val="20"/>
-          <w:szCs w:val="20"/>
-        </w:rPr>
-      </w:pPr>
-    </w:p>
-    <w:p>
-      <w:pPr>
-        <w:tabs>
-          <w:tab w:val="right" w:pos="10800"/>
-        </w:tabs>
-        <w:spacing w:after="0" w:line="228" w:lineRule="auto"/>
-        <w:rPr>
-          <w:rFonts w:ascii="Gill Sans MT" w:hAnsi="Gill Sans MT"/>
-          <w:b/>
-          <w:sz w:val="20"/>
-          <w:szCs w:val="20"/>
-        </w:rPr>
-      </w:pPr>
-      <w:r>
-        <w:rPr>
-          <w:rFonts w:ascii="Gill Sans MT" w:hAnsi="Gill Sans MT"/>
-          <w:b/>
-          <w:sz w:val="20"/>
-          <w:szCs w:val="20"/>
-          <w:u w:val="single"/>
-        </w:rPr>
-        <w:t>Transcat, Inc.</w:t>
-      </w:r>
-      <w:r>
-        <w:rPr>
-          <w:rFonts w:ascii="Gill Sans MT" w:hAnsi="Gill Sans MT"/>
-          <w:sz w:val="20"/>
-          <w:szCs w:val="20"/>
-        </w:rPr>
-        <w:tab/>
-      </w:r>
-      <w:r>
-        <w:rPr>
-          <w:rFonts w:ascii="Gill Sans MT" w:hAnsi="Gill Sans MT"/>
-          <w:b/>
-          <w:sz w:val="20"/>
-          <w:szCs w:val="20"/>
-        </w:rPr>
-        <w:t>Rochester</w:t>
-      </w:r>
-      <w:r>
-        <w:rPr>
-          <w:rFonts w:ascii="Gill Sans MT" w:hAnsi="Gill Sans MT"/>
-          <w:b/>
-          <w:sz w:val="20"/>
-          <w:szCs w:val="20"/>
-        </w:rPr>
-        <w:t>, NY</w:t>
-      </w:r>
-    </w:p>
-    <w:p>
-      <w:pPr>
-        <w:shd w:val="clear" w:color="auto" w:fill="F2F2F2" w:themeFill="background1" w:themeFillShade="F2"/>
-        <w:tabs>
-          <w:tab w:val="right" w:pos="8928"/>
-          <w:tab w:val="right" w:pos="11520"/>
-        </w:tabs>
-        <w:spacing w:after="80" w:line="228" w:lineRule="auto"/>
-        <w:rPr>
-          <w:rFonts w:ascii="Gill Sans MT" w:hAnsi="Gill Sans MT"/>
-          <w:b/>
-          <w:sz w:val="20"/>
-          <w:szCs w:val="20"/>
-        </w:rPr>
-      </w:pPr>
-      <w:r>
-        <w:rPr>
-          <w:rFonts w:ascii="Gill Sans MT" w:hAnsi="Gill Sans MT"/>
-          <w:b/>
-          <w:sz w:val="20"/>
-          <w:szCs w:val="20"/>
-        </w:rPr>
-        <w:t>Senior</w:t>
-      </w:r>
-      <w:r>
-        <w:rPr>
-          <w:rFonts w:ascii="Gill Sans MT" w:hAnsi="Gill Sans MT"/>
-          <w:b/>
-          <w:sz w:val="20"/>
-          <w:szCs w:val="20"/>
-        </w:rPr>
-        <w:t xml:space="preserve"> Software Engineer </w:t>
-      </w:r>
-      <w:r>
-        <w:rPr>
-          <w:rFonts w:ascii="Gill Sans MT" w:hAnsi="Gill Sans MT"/>
-          <w:b/>
-          <w:sz w:val="20"/>
-          <w:szCs w:val="20"/>
-        </w:rPr>
-        <w:tab/>
-      </w:r>
-      <w:r>
-        <w:rPr>
-          <w:rFonts w:ascii="Gill Sans MT" w:hAnsi="Gill Sans MT"/>
-          <w:b/>
-          <w:sz w:val="20"/>
-          <w:szCs w:val="20"/>
-        </w:rPr>
-        <w:tab/>
-        <w:t>0</w:t>
-      </w:r>
-      <w:r>
-        <w:rPr>
-          <w:rFonts w:ascii="Gill Sans MT" w:hAnsi="Gill Sans MT"/>
-          <w:b/>
-          <w:sz w:val="20"/>
-          <w:szCs w:val="20"/>
-        </w:rPr>
-        <w:t>4</w:t>
-      </w:r>
-      <w:r>
-        <w:rPr>
-          <w:rFonts w:ascii="Gill Sans MT" w:hAnsi="Gill Sans MT"/>
-          <w:b/>
-          <w:sz w:val="20"/>
-          <w:szCs w:val="20"/>
-        </w:rPr>
-        <w:t>/202</w:t>
-      </w:r>
-      <w:r>
-        <w:rPr>
-          <w:rFonts w:ascii="Gill Sans MT" w:hAnsi="Gill Sans MT"/>
-          <w:b/>
-          <w:sz w:val="20"/>
-          <w:szCs w:val="20"/>
-        </w:rPr>
-        <w:t>2</w:t>
-      </w:r>
-      <w:r>
-        <w:rPr>
-          <w:rFonts w:ascii="Gill Sans MT" w:hAnsi="Gill Sans MT"/>
-          <w:b/>
-          <w:sz w:val="20"/>
-          <w:szCs w:val="20"/>
-        </w:rPr>
-        <w:t>-</w:t>
-      </w:r>
-      <w:r>
-        <w:rPr>
-          <w:rFonts w:ascii="Gill Sans MT" w:hAnsi="Gill Sans MT"/>
-          <w:b/>
-          <w:sz w:val="20"/>
-          <w:szCs w:val="20"/>
-        </w:rPr>
-        <w:t>01/2023</w:t>
-      </w:r>
-    </w:p>
-    <w:p>
-      <w:pPr>
-        <w:pStyle w:val="ListParagraph"/>
-        <w:numPr>
-          <w:ilvl w:val="0"/>
-          <w:numId w:val="3"/>
-        </w:numPr>
-        <w:tabs>
-          <w:tab w:val="right" w:pos="10800"/>
-        </w:tabs>
-        <w:spacing w:before="120" w:after="0" w:line="228" w:lineRule="auto"/>
-        <w:rPr>
-          <w:rFonts w:ascii="Gill Sans MT" w:hAnsi="Gill Sans MT"/>
-          <w:b/>
-          <w:sz w:val="20"/>
-          <w:szCs w:val="20"/>
-          <w:u w:val="single"/>
-        </w:rPr>
-      </w:pPr>
-      <w:r>
-        <w:rPr>
-          <w:rFonts w:ascii="Gill Sans MT" w:hAnsi="Gill Sans MT"/>
-          <w:sz w:val="20"/>
-          <w:szCs w:val="20"/>
-        </w:rPr>
-        <w:t>Led a team of two junior developers, mentoring &amp; guiding successful project deliveries in a fast-paced environment.</w:t>
-      </w:r>
-    </w:p>
-    <w:p>
-      <w:pPr>
-        <w:pStyle w:val="ListParagraph"/>
-        <w:numPr>
-          <w:ilvl w:val="0"/>
-          <w:numId w:val="3"/>
-        </w:numPr>
-        <w:tabs>
-          <w:tab w:val="right" w:pos="10800"/>
-        </w:tabs>
-        <w:spacing w:before="120" w:after="0" w:line="228" w:lineRule="auto"/>
-        <w:rPr>
-          <w:rFonts w:ascii="Gill Sans MT" w:hAnsi="Gill Sans MT"/>
-          <w:b/>
-          <w:sz w:val="20"/>
-          <w:szCs w:val="20"/>
-          <w:u w:val="single"/>
-        </w:rPr>
-      </w:pPr>
-      <w:r>
-        <w:rPr>
-          <w:rFonts w:ascii="Gill Sans MT" w:hAnsi="Gill Sans MT"/>
-          <w:sz w:val="20"/>
-          <w:szCs w:val="20"/>
-        </w:rPr>
-        <w:t>Championed best practices to maintain high software quality &amp; foster team growth.</w:t>
-      </w:r>
-    </w:p>
-    <w:p>
-      <w:pPr>
-        <w:pStyle w:val="ListParagraph"/>
-        <w:numPr>
-          <w:ilvl w:val="0"/>
-          <w:numId w:val="3"/>
-        </w:numPr>
-        <w:tabs>
-          <w:tab w:val="right" w:pos="10800"/>
-        </w:tabs>
-        <w:spacing w:before="120" w:after="0" w:line="228" w:lineRule="auto"/>
-        <w:rPr>
-          <w:rFonts w:ascii="Gill Sans MT" w:hAnsi="Gill Sans MT"/>
-          <w:b/>
-          <w:sz w:val="20"/>
-          <w:szCs w:val="20"/>
-          <w:u w:val="single"/>
-        </w:rPr>
-      </w:pPr>
-      <w:r>
-        <w:rPr>
-          <w:rFonts w:ascii="Gill Sans MT" w:hAnsi="Gill Sans MT"/>
-          <w:sz w:val="20"/>
-          <w:szCs w:val="20"/>
-        </w:rPr>
-        <w:t>Built a React web app with SQL Server to track lab equipment calibrations.</w:t>
-      </w:r>
-    </w:p>
-    <w:p>
-      <w:pPr>
-        <w:pStyle w:val="ListParagraph"/>
-        <w:numPr>
-          <w:ilvl w:val="0"/>
-          <w:numId w:val="3"/>
-        </w:numPr>
-        <w:tabs>
-          <w:tab w:val="right" w:pos="10800"/>
-        </w:tabs>
-        <w:spacing w:before="120" w:after="0" w:line="228" w:lineRule="auto"/>
-        <w:rPr>
-          <w:rFonts w:ascii="Gill Sans MT" w:hAnsi="Gill Sans MT"/>
-          <w:b/>
-          <w:sz w:val="20"/>
-          <w:szCs w:val="20"/>
-          <w:u w:val="single"/>
-        </w:rPr>
-      </w:pPr>
-      <w:r>
-        <w:rPr>
-          <w:rFonts w:ascii="Gill Sans MT" w:hAnsi="Gill Sans MT"/>
-          <w:sz w:val="20"/>
-          <w:szCs w:val="20"/>
-        </w:rPr>
-        <w:t>Developed C# .NET Web APIs with NUnit tests, integrating internal systems.</w:t>
-      </w:r>
-    </w:p>
-    <w:p>
-      <w:pPr>
-        <w:pStyle w:val="ListParagraph"/>
-        <w:numPr>
-          <w:ilvl w:val="0"/>
-          <w:numId w:val="3"/>
-        </w:numPr>
-        <w:tabs>
-          <w:tab w:val="right" w:pos="10800"/>
-        </w:tabs>
-        <w:spacing w:before="120" w:after="0" w:line="228" w:lineRule="auto"/>
-        <w:rPr>
-          <w:rFonts w:ascii="Gill Sans MT" w:hAnsi="Gill Sans MT"/>
-          <w:b/>
-          <w:sz w:val="20"/>
-          <w:szCs w:val="20"/>
-          <w:u w:val="single"/>
-        </w:rPr>
-      </w:pPr>
-      <w:r>
-        <w:rPr>
-          <w:rFonts w:ascii="Gill Sans MT" w:hAnsi="Gill Sans MT"/>
-          <w:sz w:val="20"/>
-          <w:szCs w:val="20"/>
-        </w:rPr>
-        <w:t>Collaborated with external vendors to enhance the company’s Magento website.</w:t>
-      </w:r>
-    </w:p>
-    <w:p>
-      <w:pPr>
-        <w:pStyle w:val="ListParagraph"/>
-        <w:numPr>
-          <w:ilvl w:val="0"/>
-          <w:numId w:val="3"/>
-        </w:numPr>
-        <w:tabs>
-          <w:tab w:val="right" w:pos="10800"/>
-        </w:tabs>
-        <w:spacing w:before="120" w:after="0" w:line="228" w:lineRule="auto"/>
-        <w:rPr>
-          <w:rFonts w:ascii="Gill Sans MT" w:hAnsi="Gill Sans MT"/>
-          <w:b/>
-          <w:sz w:val="20"/>
-          <w:szCs w:val="20"/>
-          <w:u w:val="single"/>
-        </w:rPr>
-      </w:pPr>
-      <w:r>
-        <w:rPr>
-          <w:rFonts w:ascii="Gill Sans MT" w:hAnsi="Gill Sans MT"/>
-          <w:sz w:val="20"/>
-          <w:szCs w:val="20"/>
-        </w:rPr>
-        <w:t>Maintained &amp; improved an existing VB.NET calibration system.</w:t>
-      </w:r>
-    </w:p>
-    <w:p>
-      <w:pPr>
-        <w:tabs>
-          <w:tab w:val="right" w:pos="10800"/>
-        </w:tabs>
-        <w:spacing w:before="120" w:after="0" w:line="228" w:lineRule="auto"/>
-        <w:rPr>
-          <w:rFonts w:ascii="Gill Sans MT" w:hAnsi="Gill Sans MT"/>
-          <w:b/>
-          <w:sz w:val="20"/>
-          <w:szCs w:val="20"/>
-          <w:u w:val="single"/>
-        </w:rPr>
-      </w:pPr>
-    </w:p>
-    <w:p>
-      <w:pPr>
-        <w:tabs>
-          <w:tab w:val="right" w:pos="10800"/>
-        </w:tabs>
-        <w:spacing w:before="120" w:after="0" w:line="228" w:lineRule="auto"/>
-        <w:rPr>
-          <w:rFonts w:ascii="Gill Sans MT" w:hAnsi="Gill Sans MT"/>
-          <w:b/>
-          <w:sz w:val="20"/>
-          <w:szCs w:val="20"/>
-        </w:rPr>
-      </w:pPr>
-      <w:r>
-        <w:rPr>
-          <w:rFonts w:ascii="Gill Sans MT" w:hAnsi="Gill Sans MT"/>
-          <w:b/>
-          <w:sz w:val="20"/>
-          <w:szCs w:val="20"/>
-          <w:u w:val="single"/>
-        </w:rPr>
-        <w:t>LeaseTrack, Inc.</w:t>
-      </w:r>
-      <w:r>
-        <w:rPr>
-          <w:rFonts w:ascii="Gill Sans MT" w:hAnsi="Gill Sans MT"/>
-          <w:sz w:val="20"/>
-          <w:szCs w:val="20"/>
-        </w:rPr>
-        <w:tab/>
-      </w:r>
-      <w:r>
-        <w:rPr>
-          <w:rFonts w:ascii="Gill Sans MT" w:hAnsi="Gill Sans MT"/>
-          <w:b/>
-          <w:sz w:val="20"/>
-          <w:szCs w:val="20"/>
-        </w:rPr>
-        <w:t>Latham</w:t>
-      </w:r>
-      <w:r>
-        <w:rPr>
-          <w:rFonts w:ascii="Gill Sans MT" w:hAnsi="Gill Sans MT"/>
-          <w:b/>
-          <w:sz w:val="20"/>
-          <w:szCs w:val="20"/>
-        </w:rPr>
-        <w:t>, NY</w:t>
-      </w:r>
-    </w:p>
-    <w:p>
-      <w:pPr>
-        <w:shd w:val="clear" w:color="auto" w:fill="F2F2F2" w:themeFill="background1" w:themeFillShade="F2"/>
-        <w:tabs>
-          <w:tab w:val="right" w:pos="8928"/>
-          <w:tab w:val="right" w:pos="11520"/>
-        </w:tabs>
-        <w:spacing w:after="80" w:line="228" w:lineRule="auto"/>
-        <w:rPr>
-          <w:rFonts w:ascii="Gill Sans MT" w:hAnsi="Gill Sans MT"/>
-          <w:b/>
-          <w:sz w:val="20"/>
-          <w:szCs w:val="20"/>
-        </w:rPr>
-      </w:pPr>
-      <w:r>
-        <w:rPr>
-          <w:rFonts w:ascii="Gill Sans MT" w:hAnsi="Gill Sans MT"/>
-          <w:b/>
-          <w:sz w:val="20"/>
-          <w:szCs w:val="20"/>
-        </w:rPr>
-        <w:t>Senior</w:t>
-      </w:r>
-      <w:r>
-        <w:rPr>
-          <w:rFonts w:ascii="Gill Sans MT" w:hAnsi="Gill Sans MT"/>
-          <w:b/>
-          <w:sz w:val="20"/>
-          <w:szCs w:val="20"/>
-        </w:rPr>
-        <w:t xml:space="preserve"> Software Engineer </w:t>
-      </w:r>
-      <w:r>
-        <w:rPr>
-          <w:rFonts w:ascii="Gill Sans MT" w:hAnsi="Gill Sans MT"/>
-          <w:b/>
-          <w:sz w:val="20"/>
-          <w:szCs w:val="20"/>
-        </w:rPr>
-        <w:tab/>
-      </w:r>
-      <w:r>
-        <w:rPr>
-          <w:rFonts w:ascii="Gill Sans MT" w:hAnsi="Gill Sans MT"/>
-          <w:b/>
-          <w:sz w:val="20"/>
-          <w:szCs w:val="20"/>
-        </w:rPr>
-        <w:tab/>
-        <w:t>0</w:t>
-      </w:r>
-      <w:r>
-        <w:rPr>
-          <w:rFonts w:ascii="Gill Sans MT" w:hAnsi="Gill Sans MT"/>
-          <w:b/>
-          <w:sz w:val="20"/>
-          <w:szCs w:val="20"/>
-        </w:rPr>
-        <w:t>6</w:t>
-      </w:r>
-      <w:r>
-        <w:rPr>
-          <w:rFonts w:ascii="Gill Sans MT" w:hAnsi="Gill Sans MT"/>
-          <w:b/>
-          <w:sz w:val="20"/>
-          <w:szCs w:val="20"/>
-        </w:rPr>
-        <w:t>/202</w:t>
-      </w:r>
-      <w:r>
-        <w:rPr>
-          <w:rFonts w:ascii="Gill Sans MT" w:hAnsi="Gill Sans MT"/>
-          <w:b/>
-          <w:sz w:val="20"/>
-          <w:szCs w:val="20"/>
-        </w:rPr>
-        <w:t>1</w:t>
-      </w:r>
-      <w:r>
-        <w:rPr>
-          <w:rFonts w:ascii="Gill Sans MT" w:hAnsi="Gill Sans MT"/>
-          <w:b/>
-          <w:sz w:val="20"/>
-          <w:szCs w:val="20"/>
-        </w:rPr>
-        <w:t>-</w:t>
-      </w:r>
-      <w:r>
-        <w:rPr>
-          <w:rFonts w:ascii="Gill Sans MT" w:hAnsi="Gill Sans MT"/>
-          <w:b/>
-          <w:sz w:val="20"/>
-          <w:szCs w:val="20"/>
-        </w:rPr>
-        <w:t>04/2022</w:t>
-      </w:r>
-    </w:p>
-    <w:p>
-      <w:pPr>
-        <w:pStyle w:val="ListParagraph"/>
-        <w:numPr>
-          <w:ilvl w:val="0"/>
-          <w:numId w:val="3"/>
-        </w:numPr>
-        <w:tabs>
-          <w:tab w:val="right" w:pos="10800"/>
-        </w:tabs>
-        <w:spacing w:before="120" w:after="0" w:line="228" w:lineRule="auto"/>
-        <w:rPr>
-          <w:rFonts w:ascii="Gill Sans MT" w:hAnsi="Gill Sans MT"/>
-          <w:sz w:val="20"/>
-          <w:szCs w:val="20"/>
-        </w:rPr>
-      </w:pPr>
-      <w:r>
-        <w:rPr>
-          <w:rFonts w:ascii="Gill Sans MT" w:hAnsi="Gill Sans MT"/>
-          <w:sz w:val="20"/>
-          <w:szCs w:val="20"/>
-        </w:rPr>
-        <w:t>Built a machine learning tool using Python &amp; Amazon Textract, automating key data extraction from insurance documents &amp; accelerating CRM workflows.</w:t>
-      </w:r>
-    </w:p>
-    <w:p>
-      <w:pPr>
-        <w:pStyle w:val="ListParagraph"/>
-        <w:numPr>
-          <w:ilvl w:val="0"/>
-          <w:numId w:val="3"/>
-        </w:numPr>
-        <w:tabs>
-          <w:tab w:val="right" w:pos="10800"/>
-        </w:tabs>
-        <w:spacing w:before="120" w:after="0" w:line="228" w:lineRule="auto"/>
-        <w:rPr>
-          <w:rFonts w:ascii="Gill Sans MT" w:hAnsi="Gill Sans MT"/>
-          <w:sz w:val="20"/>
-          <w:szCs w:val="20"/>
-        </w:rPr>
-      </w:pPr>
-      <w:r>
-        <w:rPr>
-          <w:rFonts w:ascii="Gill Sans MT" w:hAnsi="Gill Sans MT"/>
-          <w:sz w:val="20"/>
-          <w:szCs w:val="20"/>
-        </w:rPr>
-        <w:t>Led end-to-end development, from technical design to implementation.</w:t>
-      </w:r>
-    </w:p>
-    <w:p>
-      <w:pPr>
-        <w:pStyle w:val="ListParagraph"/>
-        <w:numPr>
-          <w:ilvl w:val="0"/>
-          <w:numId w:val="3"/>
-        </w:numPr>
-        <w:tabs>
-          <w:tab w:val="right" w:pos="10800"/>
-        </w:tabs>
-        <w:spacing w:before="120" w:after="0" w:line="228" w:lineRule="auto"/>
-        <w:rPr>
-          <w:rFonts w:ascii="Gill Sans MT" w:hAnsi="Gill Sans MT"/>
-          <w:sz w:val="20"/>
-          <w:szCs w:val="20"/>
-        </w:rPr>
-      </w:pPr>
-      <w:r>
-        <w:rPr>
-          <w:rFonts w:ascii="Gill Sans MT" w:hAnsi="Gill Sans MT"/>
-          <w:sz w:val="20"/>
-          <w:szCs w:val="20"/>
-        </w:rPr>
-        <w:t>Delivered accurate project estimates &amp; managed the full software lifecycle.</w:t>
-      </w:r>
-    </w:p>
-    <w:p>
-      <w:pPr>
-        <w:pStyle w:val="ListParagraph"/>
-        <w:numPr>
-          <w:ilvl w:val="0"/>
-          <w:numId w:val="3"/>
-        </w:numPr>
-        <w:tabs>
-          <w:tab w:val="right" w:pos="10800"/>
-        </w:tabs>
-        <w:spacing w:before="120" w:after="0" w:line="228" w:lineRule="auto"/>
-        <w:rPr>
-          <w:rFonts w:ascii="Gill Sans MT" w:hAnsi="Gill Sans MT"/>
-          <w:sz w:val="20"/>
-          <w:szCs w:val="20"/>
-        </w:rPr>
-      </w:pPr>
-      <w:r>
-        <w:rPr>
-          <w:rFonts w:ascii="Gill Sans MT" w:hAnsi="Gill Sans MT"/>
-          <w:sz w:val="20"/>
-          <w:szCs w:val="20"/>
-        </w:rPr>
-        <w:t>Developed a document annotation system in Java Spring Boot &amp; Annotorious, streamlining ML model training for domain experts.</w:t>
-      </w:r>
-    </w:p>
-    <w:p>
-      <w:pPr>
-        <w:tabs>
-          <w:tab w:val="right" w:pos="10800"/>
-        </w:tabs>
-        <w:spacing w:before="120" w:after="0" w:line="228" w:lineRule="auto"/>
-        <w:rPr>
-          <w:rFonts w:ascii="Gill Sans MT" w:hAnsi="Gill Sans MT"/>
-          <w:b/>
-          <w:sz w:val="20"/>
-          <w:szCs w:val="20"/>
-        </w:rPr>
-      </w:pPr>
-      <w:r>
-        <w:rPr>
-          <w:rFonts w:ascii="Gill Sans MT" w:hAnsi="Gill Sans MT"/>
-          <w:b/>
-          <w:sz w:val="20"/>
-          <w:szCs w:val="20"/>
-          <w:u w:val="single"/>
-        </w:rPr>
-        <w:lastRenderedPageBreak/>
-        <w:t>Akmazio LLC</w:t>
-      </w:r>
-      <w:r>
-        <w:rPr>
-          <w:rFonts w:ascii="Gill Sans MT" w:hAnsi="Gill Sans MT"/>
-          <w:sz w:val="20"/>
-          <w:szCs w:val="20"/>
-        </w:rPr>
-        <w:tab/>
-      </w:r>
-      <w:r>
-        <w:rPr>
-          <w:rFonts w:ascii="Gill Sans MT" w:hAnsi="Gill Sans MT"/>
-          <w:b/>
-          <w:sz w:val="20"/>
-          <w:szCs w:val="20"/>
-        </w:rPr>
-        <w:t>Albany, NY</w:t>
-      </w:r>
-    </w:p>
-    <w:p>
-      <w:pPr>
-        <w:shd w:val="clear" w:color="auto" w:fill="F2F2F2" w:themeFill="background1" w:themeFillShade="F2"/>
-        <w:tabs>
-          <w:tab w:val="right" w:pos="8928"/>
-          <w:tab w:val="right" w:pos="11520"/>
-        </w:tabs>
-        <w:spacing w:after="80" w:line="228" w:lineRule="auto"/>
-        <w:rPr>
-          <w:rFonts w:ascii="Gill Sans MT" w:hAnsi="Gill Sans MT"/>
-          <w:b/>
-          <w:sz w:val="20"/>
-          <w:szCs w:val="20"/>
-        </w:rPr>
-      </w:pPr>
-      <w:r>
-        <w:rPr>
-          <w:rFonts w:ascii="Gill Sans MT" w:hAnsi="Gill Sans MT"/>
-          <w:b/>
-          <w:sz w:val="20"/>
-          <w:szCs w:val="20"/>
-        </w:rPr>
-        <w:t>Senior Software Engineer</w:t>
-      </w:r>
-      <w:r>
-        <w:rPr>
-          <w:rFonts w:ascii="Gill Sans MT" w:hAnsi="Gill Sans MT"/>
-          <w:b/>
-          <w:sz w:val="20"/>
-          <w:szCs w:val="20"/>
-        </w:rPr>
-        <w:tab/>
-      </w:r>
-      <w:r>
-        <w:rPr>
-          <w:rFonts w:ascii="Gill Sans MT" w:hAnsi="Gill Sans MT"/>
-          <w:b/>
-          <w:sz w:val="20"/>
-          <w:szCs w:val="20"/>
-        </w:rPr>
-        <w:tab/>
-      </w:r>
-      <w:r>
-        <w:rPr>
-          <w:rFonts w:ascii="Gill Sans MT" w:hAnsi="Gill Sans MT"/>
-          <w:b/>
-          <w:sz w:val="20"/>
-          <w:szCs w:val="20"/>
-        </w:rPr>
-        <w:t>0</w:t>
-      </w:r>
-      <w:r>
-        <w:rPr>
-          <w:rFonts w:ascii="Gill Sans MT" w:hAnsi="Gill Sans MT"/>
-          <w:b/>
-          <w:sz w:val="20"/>
-          <w:szCs w:val="20"/>
-        </w:rPr>
-        <w:t>5</w:t>
-      </w:r>
-      <w:r>
-        <w:rPr>
-          <w:rFonts w:ascii="Gill Sans MT" w:hAnsi="Gill Sans MT"/>
-          <w:b/>
-          <w:sz w:val="20"/>
-          <w:szCs w:val="20"/>
-        </w:rPr>
-        <w:t>/2020-</w:t>
-      </w:r>
-      <w:r>
-        <w:rPr>
-          <w:rFonts w:ascii="Gill Sans MT" w:hAnsi="Gill Sans MT"/>
-          <w:b/>
-          <w:sz w:val="20"/>
-          <w:szCs w:val="20"/>
-        </w:rPr>
-        <w:t>05/2021</w:t>
-      </w:r>
-    </w:p>
-    <w:p>
-      <w:pPr>
-        <w:pStyle w:val="ListParagraph"/>
-        <w:numPr>
-          <w:ilvl w:val="0"/>
-          <w:numId w:val="3"/>
-        </w:numPr>
-        <w:tabs>
-          <w:tab w:val="right" w:pos="10800"/>
-        </w:tabs>
-        <w:spacing w:before="120" w:after="0" w:line="228" w:lineRule="auto"/>
-        <w:rPr>
-          <w:rFonts w:ascii="Gill Sans MT" w:hAnsi="Gill Sans MT"/>
-          <w:sz w:val="20"/>
-          <w:szCs w:val="20"/>
-        </w:rPr>
-      </w:pPr>
-      <w:r>
-        <w:rPr>
-          <w:rFonts w:ascii="Gill Sans MT" w:hAnsi="Gill Sans MT"/>
-          <w:sz w:val="20"/>
-          <w:szCs w:val="20"/>
-        </w:rPr>
-        <w:t>Led a team as Scrum Master, facilitating sprints, stand-ups, sprint planning, and retrospectives.</w:t>
-      </w:r>
-    </w:p>
-    <w:p>
-      <w:pPr>
-        <w:pStyle w:val="ListParagraph"/>
-        <w:numPr>
-          <w:ilvl w:val="0"/>
-          <w:numId w:val="3"/>
-        </w:numPr>
-        <w:tabs>
-          <w:tab w:val="right" w:pos="10800"/>
-        </w:tabs>
-        <w:spacing w:before="120" w:after="0" w:line="228" w:lineRule="auto"/>
-        <w:rPr>
-          <w:rFonts w:ascii="Gill Sans MT" w:hAnsi="Gill Sans MT"/>
-          <w:sz w:val="20"/>
-          <w:szCs w:val="20"/>
-        </w:rPr>
-      </w:pPr>
-      <w:r>
-        <w:rPr>
-          <w:rFonts w:ascii="Gill Sans MT" w:hAnsi="Gill Sans MT"/>
-          <w:sz w:val="20"/>
-          <w:szCs w:val="20"/>
-        </w:rPr>
-        <w:t>Designed &amp; developed Flouriish, a mobile networking platform connecting financial advisors with small business leads.</w:t>
-      </w:r>
-    </w:p>
-    <w:p>
-      <w:pPr>
-        <w:pStyle w:val="ListParagraph"/>
-        <w:numPr>
-          <w:ilvl w:val="0"/>
-          <w:numId w:val="3"/>
-        </w:numPr>
-        <w:tabs>
-          <w:tab w:val="right" w:pos="10800"/>
-        </w:tabs>
-        <w:spacing w:before="120" w:after="0" w:line="228" w:lineRule="auto"/>
-        <w:rPr>
-          <w:rFonts w:ascii="Gill Sans MT" w:hAnsi="Gill Sans MT"/>
-          <w:sz w:val="20"/>
-          <w:szCs w:val="20"/>
-        </w:rPr>
-      </w:pPr>
-      <w:r>
-        <w:rPr>
-          <w:rFonts w:ascii="Gill Sans MT" w:hAnsi="Gill Sans MT"/>
-          <w:sz w:val="20"/>
-          <w:szCs w:val="20"/>
-        </w:rPr>
-        <w:t>Engaged 12+ financial advisors &amp; business owners for beta testing pre-launch.</w:t>
-      </w:r>
-    </w:p>
-    <w:p>
-      <w:pPr>
-        <w:pStyle w:val="ListParagraph"/>
-        <w:numPr>
-          <w:ilvl w:val="0"/>
-          <w:numId w:val="3"/>
-        </w:numPr>
-        <w:tabs>
-          <w:tab w:val="right" w:pos="10800"/>
-        </w:tabs>
-        <w:spacing w:before="120" w:after="0" w:line="228" w:lineRule="auto"/>
-        <w:rPr>
-          <w:rFonts w:ascii="Gill Sans MT" w:hAnsi="Gill Sans MT"/>
-          <w:sz w:val="20"/>
-          <w:szCs w:val="20"/>
-        </w:rPr>
-      </w:pPr>
-      <w:r>
-        <w:rPr>
-          <w:rFonts w:ascii="Gill Sans MT" w:hAnsi="Gill Sans MT"/>
-          <w:sz w:val="20"/>
-          <w:szCs w:val="20"/>
-        </w:rPr>
-        <w:t>Built &amp; implemented MS SQL database architecture and a C# Web API to power the React Native frontend.</w:t>
-      </w:r>
-    </w:p>
-    <w:p>
-      <w:pPr>
-        <w:pStyle w:val="ListParagraph"/>
-        <w:numPr>
-          <w:ilvl w:val="0"/>
-          <w:numId w:val="3"/>
-        </w:numPr>
-        <w:tabs>
-          <w:tab w:val="right" w:pos="10800"/>
-        </w:tabs>
-        <w:spacing w:before="120" w:after="0" w:line="228" w:lineRule="auto"/>
-        <w:rPr>
-          <w:rFonts w:ascii="Gill Sans MT" w:hAnsi="Gill Sans MT"/>
-          <w:sz w:val="20"/>
-          <w:szCs w:val="20"/>
-        </w:rPr>
-      </w:pPr>
-      <w:r>
-        <w:rPr>
-          <w:rFonts w:ascii="Gill Sans MT" w:hAnsi="Gill Sans MT"/>
-          <w:sz w:val="20"/>
-          <w:szCs w:val="20"/>
-        </w:rPr>
-        <w:t>Standardized server infrastructure using DigitalOcean, Cloudflare, Ubuntu, .NET Core, GitHub, &amp; custom bash scripting.</w:t>
-      </w:r>
-    </w:p>
-    <w:p>
-      <w:pPr>
-        <w:tabs>
-          <w:tab w:val="right" w:pos="10800"/>
-        </w:tabs>
-        <w:spacing w:before="120" w:after="0" w:line="228" w:lineRule="auto"/>
-        <w:rPr>
-          <w:rFonts w:ascii="Gill Sans MT" w:hAnsi="Gill Sans MT"/>
-          <w:sz w:val="20"/>
-          <w:szCs w:val="20"/>
-        </w:rPr>
-      </w:pPr>
-    </w:p>
-    <w:p>
-      <w:pPr>
-        <w:tabs>
-          <w:tab w:val="right" w:pos="10800"/>
-        </w:tabs>
-        <w:spacing w:before="120" w:after="0" w:line="228" w:lineRule="auto"/>
-        <w:rPr>
-          <w:rFonts w:ascii="Gill Sans MT" w:hAnsi="Gill Sans MT"/>
-          <w:b/>
-          <w:sz w:val="20"/>
-          <w:szCs w:val="20"/>
-        </w:rPr>
-      </w:pPr>
-      <w:r>
-        <w:rPr>
-          <w:rFonts w:ascii="Gill Sans MT" w:hAnsi="Gill Sans MT"/>
-          <w:b/>
-          <w:sz w:val="20"/>
-          <w:szCs w:val="20"/>
-          <w:u w:val="single"/>
-        </w:rPr>
-        <w:t>Bestpass, Inc.</w:t>
-      </w:r>
-      <w:r>
-        <w:rPr>
-          <w:rFonts w:ascii="Gill Sans MT" w:hAnsi="Gill Sans MT"/>
-          <w:sz w:val="20"/>
-          <w:szCs w:val="20"/>
-        </w:rPr>
-        <w:tab/>
-      </w:r>
-      <w:r>
-        <w:rPr>
-          <w:rFonts w:ascii="Gill Sans MT" w:hAnsi="Gill Sans MT"/>
-          <w:b/>
-          <w:sz w:val="20"/>
-          <w:szCs w:val="20"/>
-        </w:rPr>
-        <w:t>Albany, NY</w:t>
-      </w:r>
-    </w:p>
-    <w:p>
-      <w:pPr>
-        <w:shd w:val="clear" w:color="auto" w:fill="F2F2F2" w:themeFill="background1" w:themeFillShade="F2"/>
-        <w:tabs>
-          <w:tab w:val="right" w:pos="8928"/>
-          <w:tab w:val="right" w:pos="11520"/>
-        </w:tabs>
-        <w:spacing w:after="80" w:line="228" w:lineRule="auto"/>
-        <w:rPr>
-          <w:rFonts w:ascii="Gill Sans MT" w:hAnsi="Gill Sans MT"/>
-          <w:b/>
-          <w:sz w:val="20"/>
-          <w:szCs w:val="20"/>
-        </w:rPr>
-      </w:pPr>
-      <w:r>
-        <w:rPr>
-          <w:rFonts w:ascii="Gill Sans MT" w:hAnsi="Gill Sans MT"/>
-          <w:b/>
-          <w:sz w:val="20"/>
-          <w:szCs w:val="20"/>
-        </w:rPr>
-        <w:t xml:space="preserve">Software Engineer </w:t>
-      </w:r>
-      <w:r>
-        <w:rPr>
-          <w:rFonts w:ascii="Gill Sans MT" w:hAnsi="Gill Sans MT"/>
-          <w:b/>
-          <w:sz w:val="20"/>
-          <w:szCs w:val="20"/>
-        </w:rPr>
-        <w:tab/>
-      </w:r>
-      <w:r>
-        <w:rPr>
-          <w:rFonts w:ascii="Gill Sans MT" w:hAnsi="Gill Sans MT"/>
-          <w:b/>
-          <w:sz w:val="20"/>
-          <w:szCs w:val="20"/>
-        </w:rPr>
-        <w:tab/>
-        <w:t>09/2019-04/2020</w:t>
-      </w:r>
-    </w:p>
-    <w:p>
-      <w:pPr>
-        <w:pStyle w:val="ListParagraph"/>
-        <w:numPr>
-          <w:ilvl w:val="0"/>
-          <w:numId w:val="3"/>
-        </w:numPr>
-        <w:tabs>
-          <w:tab w:val="right" w:pos="10800"/>
-        </w:tabs>
-        <w:spacing w:before="120" w:after="0" w:line="228" w:lineRule="auto"/>
-        <w:rPr>
-          <w:rFonts w:ascii="Gill Sans MT" w:hAnsi="Gill Sans MT"/>
-          <w:sz w:val="20"/>
-          <w:szCs w:val="20"/>
-        </w:rPr>
-      </w:pPr>
-      <w:r>
-        <w:rPr>
-          <w:rFonts w:ascii="Gill Sans MT" w:hAnsi="Gill Sans MT"/>
-          <w:sz w:val="20"/>
-          <w:szCs w:val="20"/>
-        </w:rPr>
-        <w:t>Actively contributed to Scrum processes, participating in sprints &amp; ceremonies.</w:t>
-      </w:r>
-    </w:p>
-    <w:p>
-      <w:pPr>
-        <w:pStyle w:val="ListParagraph"/>
-        <w:numPr>
-          <w:ilvl w:val="0"/>
-          <w:numId w:val="3"/>
-        </w:numPr>
-        <w:tabs>
-          <w:tab w:val="right" w:pos="10800"/>
-        </w:tabs>
-        <w:spacing w:before="120" w:after="0" w:line="228" w:lineRule="auto"/>
-        <w:rPr>
-          <w:rFonts w:ascii="Gill Sans MT" w:hAnsi="Gill Sans MT"/>
-          <w:sz w:val="20"/>
-          <w:szCs w:val="20"/>
-        </w:rPr>
-      </w:pPr>
-      <w:r>
-        <w:rPr>
-          <w:rFonts w:ascii="Gill Sans MT" w:hAnsi="Gill Sans MT"/>
-          <w:sz w:val="20"/>
-          <w:szCs w:val="20"/>
-        </w:rPr>
-        <w:t>Designed &amp; implemented high-quality software architecture, prioritizing &amp; executing tasks across the SDLC.</w:t>
-      </w:r>
-    </w:p>
-    <w:p>
-      <w:pPr>
-        <w:pStyle w:val="ListParagraph"/>
-        <w:numPr>
-          <w:ilvl w:val="0"/>
-          <w:numId w:val="3"/>
-        </w:numPr>
-        <w:tabs>
-          <w:tab w:val="right" w:pos="10800"/>
-        </w:tabs>
-        <w:spacing w:before="120" w:after="0" w:line="228" w:lineRule="auto"/>
-        <w:rPr>
-          <w:rFonts w:ascii="Gill Sans MT" w:hAnsi="Gill Sans MT"/>
-          <w:sz w:val="20"/>
-          <w:szCs w:val="20"/>
-        </w:rPr>
-      </w:pPr>
-      <w:r>
-        <w:rPr>
-          <w:rFonts w:ascii="Gill Sans MT" w:hAnsi="Gill Sans MT"/>
-          <w:sz w:val="20"/>
-          <w:szCs w:val="20"/>
-        </w:rPr>
-        <w:t>Developed a toll bill consolidation system for trucking companies, organizing costs by cost center.</w:t>
-      </w:r>
-    </w:p>
-    <w:p>
-      <w:pPr>
-        <w:pStyle w:val="ListParagraph"/>
-        <w:numPr>
-          <w:ilvl w:val="0"/>
-          <w:numId w:val="3"/>
-        </w:numPr>
-        <w:tabs>
-          <w:tab w:val="right" w:pos="10800"/>
-        </w:tabs>
-        <w:spacing w:before="120" w:after="0" w:line="228" w:lineRule="auto"/>
-        <w:rPr>
-          <w:rFonts w:ascii="Gill Sans MT" w:hAnsi="Gill Sans MT"/>
-          <w:sz w:val="20"/>
-          <w:szCs w:val="20"/>
-        </w:rPr>
-      </w:pPr>
-      <w:r>
-        <w:rPr>
-          <w:rFonts w:ascii="Gill Sans MT" w:hAnsi="Gill Sans MT"/>
-          <w:sz w:val="20"/>
-          <w:szCs w:val="20"/>
-        </w:rPr>
-        <w:t>Enhanced and maintained a C# MVC &amp; Knockout.js web app, along with MS SQL stored procedures.</w:t>
-      </w:r>
-    </w:p>
-    <w:p>
-      <w:pPr>
-        <w:pStyle w:val="ListParagraph"/>
-        <w:numPr>
-          <w:ilvl w:val="0"/>
-          <w:numId w:val="3"/>
-        </w:numPr>
-        <w:tabs>
-          <w:tab w:val="right" w:pos="10800"/>
-        </w:tabs>
-        <w:spacing w:before="120" w:after="0" w:line="228" w:lineRule="auto"/>
-        <w:rPr>
-          <w:rFonts w:ascii="Gill Sans MT" w:hAnsi="Gill Sans MT"/>
-          <w:sz w:val="20"/>
-          <w:szCs w:val="20"/>
-        </w:rPr>
-      </w:pPr>
-      <w:r>
-        <w:rPr>
-          <w:rFonts w:ascii="Gill Sans MT" w:hAnsi="Gill Sans MT"/>
-          <w:sz w:val="20"/>
-          <w:szCs w:val="20"/>
-        </w:rPr>
-        <w:t>Improved legacy code quality by integrating automated unit tests to boost code coverage.</w:t>
-      </w:r>
-    </w:p>
-    <w:p>
-      <w:pPr>
-        <w:tabs>
-          <w:tab w:val="right" w:pos="10800"/>
-        </w:tabs>
-        <w:spacing w:before="120" w:after="0" w:line="228" w:lineRule="auto"/>
-        <w:rPr>
-          <w:rFonts w:ascii="Gill Sans MT" w:hAnsi="Gill Sans MT"/>
-          <w:sz w:val="20"/>
-          <w:szCs w:val="20"/>
-        </w:rPr>
-      </w:pPr>
-    </w:p>
-    <w:p>
-      <w:pPr>
-        <w:tabs>
-          <w:tab w:val="right" w:pos="10800"/>
-        </w:tabs>
-        <w:spacing w:before="120" w:after="0" w:line="228" w:lineRule="auto"/>
-        <w:rPr>
-          <w:rFonts w:ascii="Gill Sans MT" w:hAnsi="Gill Sans MT"/>
-          <w:b/>
-          <w:sz w:val="20"/>
-          <w:szCs w:val="20"/>
-        </w:rPr>
-      </w:pPr>
-      <w:r>
-        <w:rPr>
-          <w:rFonts w:ascii="Gill Sans MT" w:hAnsi="Gill Sans MT"/>
-          <w:b/>
-          <w:sz w:val="20"/>
-          <w:szCs w:val="20"/>
-          <w:u w:val="single"/>
-        </w:rPr>
-        <w:t>New York State Insurance Fund</w:t>
-      </w:r>
-      <w:r>
-        <w:rPr>
-          <w:rFonts w:ascii="Gill Sans MT" w:hAnsi="Gill Sans MT"/>
-          <w:sz w:val="20"/>
-          <w:szCs w:val="20"/>
-        </w:rPr>
-        <w:tab/>
-      </w:r>
-      <w:r>
-        <w:rPr>
-          <w:rFonts w:ascii="Gill Sans MT" w:hAnsi="Gill Sans MT"/>
-          <w:b/>
-          <w:sz w:val="20"/>
-          <w:szCs w:val="20"/>
-        </w:rPr>
-        <w:t>Albany, NY</w:t>
-      </w:r>
-    </w:p>
-    <w:p>
-      <w:pPr>
-        <w:shd w:val="clear" w:color="auto" w:fill="F2F2F2" w:themeFill="background1" w:themeFillShade="F2"/>
-        <w:tabs>
-          <w:tab w:val="right" w:pos="8928"/>
-          <w:tab w:val="right" w:pos="11520"/>
-        </w:tabs>
-        <w:spacing w:after="80" w:line="228" w:lineRule="auto"/>
-        <w:rPr>
-          <w:rFonts w:ascii="Gill Sans MT" w:hAnsi="Gill Sans MT"/>
-          <w:b/>
-          <w:sz w:val="20"/>
-          <w:szCs w:val="20"/>
-        </w:rPr>
-      </w:pPr>
-      <w:r>
-        <w:rPr>
-          <w:rFonts w:ascii="Gill Sans MT" w:hAnsi="Gill Sans MT"/>
-          <w:b/>
-          <w:sz w:val="20"/>
-          <w:szCs w:val="20"/>
-        </w:rPr>
-        <w:t xml:space="preserve">Software </w:t>
-      </w:r>
-      <w:r>
-        <w:rPr>
-          <w:rFonts w:ascii="Gill Sans MT" w:hAnsi="Gill Sans MT"/>
-          <w:b/>
-          <w:sz w:val="20"/>
-          <w:szCs w:val="20"/>
-        </w:rPr>
-        <w:t>Engineer</w:t>
-      </w:r>
-      <w:r>
-        <w:rPr>
-          <w:rFonts w:ascii="Gill Sans MT" w:hAnsi="Gill Sans MT"/>
-          <w:b/>
-          <w:sz w:val="20"/>
-          <w:szCs w:val="20"/>
-        </w:rPr>
-        <w:t xml:space="preserve"> </w:t>
-      </w:r>
-      <w:r>
-        <w:rPr>
-          <w:rFonts w:ascii="Gill Sans MT" w:hAnsi="Gill Sans MT"/>
-          <w:b/>
-          <w:sz w:val="20"/>
-          <w:szCs w:val="20"/>
-        </w:rPr>
-        <w:tab/>
-      </w:r>
-      <w:r>
-        <w:rPr>
-          <w:rFonts w:ascii="Gill Sans MT" w:hAnsi="Gill Sans MT"/>
-          <w:b/>
-          <w:sz w:val="20"/>
-          <w:szCs w:val="20"/>
-        </w:rPr>
-        <w:tab/>
-        <w:t>03/2015-08/2019</w:t>
+        <w:t>Implemented the PE Nightly Cron &amp; Scheduler, automating database operations.</w:t>
       </w:r>
     </w:p>
     <w:p>
@@ -2586,7 +1781,1391 @@
           <w:sz w:val="20"/>
           <w:szCs w:val="20"/>
         </w:rPr>
-        <w:t>Improved system quality by identifying issues, standardizing processes, and developing SOPs.</w:t>
+        <w:t>Explored DBT for Snowflake transformations &amp; version control in a proof of concept.</w:t>
+      </w:r>
+    </w:p>
+    <w:p>
+      <w:pPr>
+        <w:spacing w:after="0" w:line="228" w:lineRule="auto"/>
+        <w:rPr>
+          <w:rFonts w:ascii="Gill Sans MT" w:hAnsi="Gill Sans MT"/>
+          <w:sz w:val="20"/>
+          <w:szCs w:val="20"/>
+        </w:rPr>
+      </w:pPr>
+    </w:p>
+    <w:p>
+      <w:pPr>
+        <w:tabs>
+          <w:tab w:val="right" w:pos="10800"/>
+        </w:tabs>
+        <w:spacing w:after="0" w:line="228" w:lineRule="auto"/>
+        <w:rPr>
+          <w:rFonts w:ascii="Gill Sans MT" w:hAnsi="Gill Sans MT"/>
+          <w:b/>
+          <w:sz w:val="20"/>
+          <w:szCs w:val="20"/>
+        </w:rPr>
+      </w:pPr>
+      <w:proofErr w:type="spellStart"/>
+      <w:r>
+        <w:rPr>
+          <w:rFonts w:ascii="Gill Sans MT" w:hAnsi="Gill Sans MT"/>
+          <w:b/>
+          <w:sz w:val="20"/>
+          <w:szCs w:val="20"/>
+          <w:u w:val="single"/>
+        </w:rPr>
+        <w:t>Transcat</w:t>
+      </w:r>
+      <w:proofErr w:type="spellEnd"/>
+      <w:r>
+        <w:rPr>
+          <w:rFonts w:ascii="Gill Sans MT" w:hAnsi="Gill Sans MT"/>
+          <w:b/>
+          <w:sz w:val="20"/>
+          <w:szCs w:val="20"/>
+          <w:u w:val="single"/>
+        </w:rPr>
+        <w:t>, Inc.</w:t>
+      </w:r>
+      <w:r>
+        <w:rPr>
+          <w:rFonts w:ascii="Gill Sans MT" w:hAnsi="Gill Sans MT"/>
+          <w:sz w:val="20"/>
+          <w:szCs w:val="20"/>
+        </w:rPr>
+        <w:tab/>
+      </w:r>
+      <w:r>
+        <w:rPr>
+          <w:rFonts w:ascii="Gill Sans MT" w:hAnsi="Gill Sans MT"/>
+          <w:b/>
+          <w:sz w:val="20"/>
+          <w:szCs w:val="20"/>
+        </w:rPr>
+        <w:t>Rochester</w:t>
+      </w:r>
+      <w:r>
+        <w:rPr>
+          <w:rFonts w:ascii="Gill Sans MT" w:hAnsi="Gill Sans MT"/>
+          <w:b/>
+          <w:sz w:val="20"/>
+          <w:szCs w:val="20"/>
+        </w:rPr>
+        <w:t>, NY</w:t>
+      </w:r>
+    </w:p>
+    <w:p>
+      <w:pPr>
+        <w:shd w:val="clear" w:color="auto" w:fill="F2F2F2" w:themeFill="background1" w:themeFillShade="F2"/>
+        <w:tabs>
+          <w:tab w:val="right" w:pos="8928"/>
+          <w:tab w:val="right" w:pos="11520"/>
+        </w:tabs>
+        <w:spacing w:after="80" w:line="228" w:lineRule="auto"/>
+        <w:rPr>
+          <w:rFonts w:ascii="Gill Sans MT" w:hAnsi="Gill Sans MT"/>
+          <w:b/>
+          <w:sz w:val="20"/>
+          <w:szCs w:val="20"/>
+        </w:rPr>
+      </w:pPr>
+      <w:r>
+        <w:rPr>
+          <w:rFonts w:ascii="Gill Sans MT" w:hAnsi="Gill Sans MT"/>
+          <w:b/>
+          <w:sz w:val="20"/>
+          <w:szCs w:val="20"/>
+        </w:rPr>
+        <w:t>Senior</w:t>
+      </w:r>
+      <w:r>
+        <w:rPr>
+          <w:rFonts w:ascii="Gill Sans MT" w:hAnsi="Gill Sans MT"/>
+          <w:b/>
+          <w:sz w:val="20"/>
+          <w:szCs w:val="20"/>
+        </w:rPr>
+        <w:t xml:space="preserve"> Software Engineer </w:t>
+      </w:r>
+      <w:r>
+        <w:rPr>
+          <w:rFonts w:ascii="Gill Sans MT" w:hAnsi="Gill Sans MT"/>
+          <w:b/>
+          <w:sz w:val="20"/>
+          <w:szCs w:val="20"/>
+        </w:rPr>
+        <w:tab/>
+      </w:r>
+      <w:r>
+        <w:rPr>
+          <w:rFonts w:ascii="Gill Sans MT" w:hAnsi="Gill Sans MT"/>
+          <w:b/>
+          <w:sz w:val="20"/>
+          <w:szCs w:val="20"/>
+        </w:rPr>
+        <w:tab/>
+        <w:t>0</w:t>
+      </w:r>
+      <w:r>
+        <w:rPr>
+          <w:rFonts w:ascii="Gill Sans MT" w:hAnsi="Gill Sans MT"/>
+          <w:b/>
+          <w:sz w:val="20"/>
+          <w:szCs w:val="20"/>
+        </w:rPr>
+        <w:t>4</w:t>
+      </w:r>
+      <w:r>
+        <w:rPr>
+          <w:rFonts w:ascii="Gill Sans MT" w:hAnsi="Gill Sans MT"/>
+          <w:b/>
+          <w:sz w:val="20"/>
+          <w:szCs w:val="20"/>
+        </w:rPr>
+        <w:t>/202</w:t>
+      </w:r>
+      <w:r>
+        <w:rPr>
+          <w:rFonts w:ascii="Gill Sans MT" w:hAnsi="Gill Sans MT"/>
+          <w:b/>
+          <w:sz w:val="20"/>
+          <w:szCs w:val="20"/>
+        </w:rPr>
+        <w:t>2</w:t>
+      </w:r>
+      <w:r>
+        <w:rPr>
+          <w:rFonts w:ascii="Gill Sans MT" w:hAnsi="Gill Sans MT"/>
+          <w:b/>
+          <w:sz w:val="20"/>
+          <w:szCs w:val="20"/>
+        </w:rPr>
+        <w:t>-</w:t>
+      </w:r>
+      <w:r>
+        <w:rPr>
+          <w:rFonts w:ascii="Gill Sans MT" w:hAnsi="Gill Sans MT"/>
+          <w:b/>
+          <w:sz w:val="20"/>
+          <w:szCs w:val="20"/>
+        </w:rPr>
+        <w:t>01/2023</w:t>
+      </w:r>
+    </w:p>
+    <w:p>
+      <w:pPr>
+        <w:pStyle w:val="ListParagraph"/>
+        <w:numPr>
+          <w:ilvl w:val="0"/>
+          <w:numId w:val="3"/>
+        </w:numPr>
+        <w:tabs>
+          <w:tab w:val="right" w:pos="10800"/>
+        </w:tabs>
+        <w:spacing w:before="120" w:after="0" w:line="228" w:lineRule="auto"/>
+        <w:rPr>
+          <w:rFonts w:ascii="Gill Sans MT" w:hAnsi="Gill Sans MT"/>
+          <w:b/>
+          <w:sz w:val="20"/>
+          <w:szCs w:val="20"/>
+          <w:u w:val="single"/>
+        </w:rPr>
+      </w:pPr>
+      <w:r>
+        <w:rPr>
+          <w:rFonts w:ascii="Gill Sans MT" w:hAnsi="Gill Sans MT"/>
+          <w:sz w:val="20"/>
+          <w:szCs w:val="20"/>
+        </w:rPr>
+        <w:t>Led a team of two junior developers, mentoring &amp; guiding successful project deliveries in a fast-paced environment.</w:t>
+      </w:r>
+    </w:p>
+    <w:p>
+      <w:pPr>
+        <w:pStyle w:val="ListParagraph"/>
+        <w:numPr>
+          <w:ilvl w:val="0"/>
+          <w:numId w:val="3"/>
+        </w:numPr>
+        <w:tabs>
+          <w:tab w:val="right" w:pos="10800"/>
+        </w:tabs>
+        <w:spacing w:before="120" w:after="0" w:line="228" w:lineRule="auto"/>
+        <w:rPr>
+          <w:rFonts w:ascii="Gill Sans MT" w:hAnsi="Gill Sans MT"/>
+          <w:b/>
+          <w:sz w:val="20"/>
+          <w:szCs w:val="20"/>
+          <w:u w:val="single"/>
+        </w:rPr>
+      </w:pPr>
+      <w:r>
+        <w:rPr>
+          <w:rFonts w:ascii="Gill Sans MT" w:hAnsi="Gill Sans MT"/>
+          <w:sz w:val="20"/>
+          <w:szCs w:val="20"/>
+        </w:rPr>
+        <w:t>Championed best practices to maintain high software quality &amp; foster team growth.</w:t>
+      </w:r>
+    </w:p>
+    <w:p>
+      <w:pPr>
+        <w:pStyle w:val="ListParagraph"/>
+        <w:numPr>
+          <w:ilvl w:val="0"/>
+          <w:numId w:val="3"/>
+        </w:numPr>
+        <w:tabs>
+          <w:tab w:val="right" w:pos="10800"/>
+        </w:tabs>
+        <w:spacing w:before="120" w:after="0" w:line="228" w:lineRule="auto"/>
+        <w:rPr>
+          <w:rFonts w:ascii="Gill Sans MT" w:hAnsi="Gill Sans MT"/>
+          <w:b/>
+          <w:sz w:val="20"/>
+          <w:szCs w:val="20"/>
+          <w:u w:val="single"/>
+        </w:rPr>
+      </w:pPr>
+      <w:r>
+        <w:rPr>
+          <w:rFonts w:ascii="Gill Sans MT" w:hAnsi="Gill Sans MT"/>
+          <w:sz w:val="20"/>
+          <w:szCs w:val="20"/>
+        </w:rPr>
+        <w:t>Built a React web app with SQL Server to track lab equipment calibrations.</w:t>
+      </w:r>
+    </w:p>
+    <w:p>
+      <w:pPr>
+        <w:pStyle w:val="ListParagraph"/>
+        <w:numPr>
+          <w:ilvl w:val="0"/>
+          <w:numId w:val="3"/>
+        </w:numPr>
+        <w:tabs>
+          <w:tab w:val="right" w:pos="10800"/>
+        </w:tabs>
+        <w:spacing w:before="120" w:after="0" w:line="228" w:lineRule="auto"/>
+        <w:rPr>
+          <w:rFonts w:ascii="Gill Sans MT" w:hAnsi="Gill Sans MT"/>
+          <w:b/>
+          <w:sz w:val="20"/>
+          <w:szCs w:val="20"/>
+          <w:u w:val="single"/>
+        </w:rPr>
+      </w:pPr>
+      <w:r>
+        <w:rPr>
+          <w:rFonts w:ascii="Gill Sans MT" w:hAnsi="Gill Sans MT"/>
+          <w:sz w:val="20"/>
+          <w:szCs w:val="20"/>
+        </w:rPr>
+        <w:t xml:space="preserve">Developed C# .NET Web APIs with </w:t>
+      </w:r>
+      <w:proofErr w:type="spellStart"/>
+      <w:r>
+        <w:rPr>
+          <w:rFonts w:ascii="Gill Sans MT" w:hAnsi="Gill Sans MT"/>
+          <w:sz w:val="20"/>
+          <w:szCs w:val="20"/>
+        </w:rPr>
+        <w:t>NUnit</w:t>
+      </w:r>
+      <w:proofErr w:type="spellEnd"/>
+      <w:r>
+        <w:rPr>
+          <w:rFonts w:ascii="Gill Sans MT" w:hAnsi="Gill Sans MT"/>
+          <w:sz w:val="20"/>
+          <w:szCs w:val="20"/>
+        </w:rPr>
+        <w:t xml:space="preserve"> tests, integrating internal systems.</w:t>
+      </w:r>
+    </w:p>
+    <w:p>
+      <w:pPr>
+        <w:pStyle w:val="ListParagraph"/>
+        <w:numPr>
+          <w:ilvl w:val="0"/>
+          <w:numId w:val="3"/>
+        </w:numPr>
+        <w:tabs>
+          <w:tab w:val="right" w:pos="10800"/>
+        </w:tabs>
+        <w:spacing w:before="120" w:after="0" w:line="228" w:lineRule="auto"/>
+        <w:rPr>
+          <w:rFonts w:ascii="Gill Sans MT" w:hAnsi="Gill Sans MT"/>
+          <w:b/>
+          <w:sz w:val="20"/>
+          <w:szCs w:val="20"/>
+          <w:u w:val="single"/>
+        </w:rPr>
+      </w:pPr>
+      <w:r>
+        <w:rPr>
+          <w:rFonts w:ascii="Gill Sans MT" w:hAnsi="Gill Sans MT"/>
+          <w:sz w:val="20"/>
+          <w:szCs w:val="20"/>
+        </w:rPr>
+        <w:t>Collaborated with external vendors to enhance the company’s Magento website.</w:t>
+      </w:r>
+    </w:p>
+    <w:p>
+      <w:pPr>
+        <w:pStyle w:val="ListParagraph"/>
+        <w:numPr>
+          <w:ilvl w:val="0"/>
+          <w:numId w:val="3"/>
+        </w:numPr>
+        <w:tabs>
+          <w:tab w:val="right" w:pos="10800"/>
+        </w:tabs>
+        <w:spacing w:before="120" w:after="0" w:line="228" w:lineRule="auto"/>
+        <w:rPr>
+          <w:rFonts w:ascii="Gill Sans MT" w:hAnsi="Gill Sans MT"/>
+          <w:b/>
+          <w:sz w:val="20"/>
+          <w:szCs w:val="20"/>
+          <w:u w:val="single"/>
+        </w:rPr>
+      </w:pPr>
+      <w:r>
+        <w:rPr>
+          <w:rFonts w:ascii="Gill Sans MT" w:hAnsi="Gill Sans MT"/>
+          <w:sz w:val="20"/>
+          <w:szCs w:val="20"/>
+        </w:rPr>
+        <w:t>Maintained &amp; improved an existing VB.NET calibration system.</w:t>
+      </w:r>
+    </w:p>
+    <w:p>
+      <w:pPr>
+        <w:tabs>
+          <w:tab w:val="right" w:pos="10800"/>
+        </w:tabs>
+        <w:spacing w:before="120" w:after="0" w:line="228" w:lineRule="auto"/>
+        <w:rPr>
+          <w:rFonts w:ascii="Gill Sans MT" w:hAnsi="Gill Sans MT"/>
+          <w:b/>
+          <w:sz w:val="20"/>
+          <w:szCs w:val="20"/>
+          <w:u w:val="single"/>
+        </w:rPr>
+      </w:pPr>
+    </w:p>
+    <w:p>
+      <w:pPr>
+        <w:tabs>
+          <w:tab w:val="right" w:pos="10800"/>
+        </w:tabs>
+        <w:spacing w:before="120" w:after="0" w:line="228" w:lineRule="auto"/>
+        <w:rPr>
+          <w:rFonts w:ascii="Gill Sans MT" w:hAnsi="Gill Sans MT"/>
+          <w:b/>
+          <w:sz w:val="20"/>
+          <w:szCs w:val="20"/>
+          <w:u w:val="single"/>
+        </w:rPr>
+      </w:pPr>
+    </w:p>
+    <w:p>
+      <w:pPr>
+        <w:tabs>
+          <w:tab w:val="right" w:pos="10800"/>
+        </w:tabs>
+        <w:spacing w:before="120" w:after="0" w:line="228" w:lineRule="auto"/>
+        <w:rPr>
+          <w:rFonts w:ascii="Gill Sans MT" w:hAnsi="Gill Sans MT"/>
+          <w:b/>
+          <w:sz w:val="20"/>
+          <w:szCs w:val="20"/>
+          <w:u w:val="single"/>
+        </w:rPr>
+      </w:pPr>
+    </w:p>
+    <w:p>
+      <w:pPr>
+        <w:tabs>
+          <w:tab w:val="right" w:pos="10800"/>
+        </w:tabs>
+        <w:spacing w:before="120" w:after="0" w:line="228" w:lineRule="auto"/>
+        <w:rPr>
+          <w:rFonts w:ascii="Gill Sans MT" w:hAnsi="Gill Sans MT"/>
+          <w:b/>
+          <w:sz w:val="20"/>
+          <w:szCs w:val="20"/>
+          <w:u w:val="single"/>
+        </w:rPr>
+      </w:pPr>
+    </w:p>
+    <w:p>
+      <w:pPr>
+        <w:tabs>
+          <w:tab w:val="right" w:pos="10800"/>
+        </w:tabs>
+        <w:spacing w:before="120" w:after="0" w:line="228" w:lineRule="auto"/>
+        <w:rPr>
+          <w:rFonts w:ascii="Gill Sans MT" w:hAnsi="Gill Sans MT"/>
+          <w:b/>
+          <w:sz w:val="20"/>
+          <w:szCs w:val="20"/>
+        </w:rPr>
+      </w:pPr>
+      <w:proofErr w:type="spellStart"/>
+      <w:r>
+        <w:rPr>
+          <w:rFonts w:ascii="Gill Sans MT" w:hAnsi="Gill Sans MT"/>
+          <w:b/>
+          <w:sz w:val="20"/>
+          <w:szCs w:val="20"/>
+          <w:u w:val="single"/>
+        </w:rPr>
+        <w:lastRenderedPageBreak/>
+        <w:t>LeaseTrack</w:t>
+      </w:r>
+      <w:proofErr w:type="spellEnd"/>
+      <w:r>
+        <w:rPr>
+          <w:rFonts w:ascii="Gill Sans MT" w:hAnsi="Gill Sans MT"/>
+          <w:b/>
+          <w:sz w:val="20"/>
+          <w:szCs w:val="20"/>
+          <w:u w:val="single"/>
+        </w:rPr>
+        <w:t>, Inc.</w:t>
+      </w:r>
+      <w:r>
+        <w:rPr>
+          <w:rFonts w:ascii="Gill Sans MT" w:hAnsi="Gill Sans MT"/>
+          <w:sz w:val="20"/>
+          <w:szCs w:val="20"/>
+        </w:rPr>
+        <w:tab/>
+      </w:r>
+      <w:r>
+        <w:rPr>
+          <w:rFonts w:ascii="Gill Sans MT" w:hAnsi="Gill Sans MT"/>
+          <w:b/>
+          <w:sz w:val="20"/>
+          <w:szCs w:val="20"/>
+        </w:rPr>
+        <w:t>Latham</w:t>
+      </w:r>
+      <w:r>
+        <w:rPr>
+          <w:rFonts w:ascii="Gill Sans MT" w:hAnsi="Gill Sans MT"/>
+          <w:b/>
+          <w:sz w:val="20"/>
+          <w:szCs w:val="20"/>
+        </w:rPr>
+        <w:t>, NY</w:t>
+      </w:r>
+    </w:p>
+    <w:p>
+      <w:pPr>
+        <w:shd w:val="clear" w:color="auto" w:fill="F2F2F2" w:themeFill="background1" w:themeFillShade="F2"/>
+        <w:tabs>
+          <w:tab w:val="right" w:pos="8928"/>
+          <w:tab w:val="right" w:pos="11520"/>
+        </w:tabs>
+        <w:spacing w:after="80" w:line="228" w:lineRule="auto"/>
+        <w:rPr>
+          <w:rFonts w:ascii="Gill Sans MT" w:hAnsi="Gill Sans MT"/>
+          <w:b/>
+          <w:sz w:val="20"/>
+          <w:szCs w:val="20"/>
+        </w:rPr>
+      </w:pPr>
+      <w:r>
+        <w:rPr>
+          <w:rFonts w:ascii="Gill Sans MT" w:hAnsi="Gill Sans MT"/>
+          <w:b/>
+          <w:sz w:val="20"/>
+          <w:szCs w:val="20"/>
+        </w:rPr>
+        <w:t>Senior</w:t>
+      </w:r>
+      <w:r>
+        <w:rPr>
+          <w:rFonts w:ascii="Gill Sans MT" w:hAnsi="Gill Sans MT"/>
+          <w:b/>
+          <w:sz w:val="20"/>
+          <w:szCs w:val="20"/>
+        </w:rPr>
+        <w:t xml:space="preserve"> Software Engineer </w:t>
+      </w:r>
+      <w:r>
+        <w:rPr>
+          <w:rFonts w:ascii="Gill Sans MT" w:hAnsi="Gill Sans MT"/>
+          <w:b/>
+          <w:sz w:val="20"/>
+          <w:szCs w:val="20"/>
+        </w:rPr>
+        <w:tab/>
+      </w:r>
+      <w:r>
+        <w:rPr>
+          <w:rFonts w:ascii="Gill Sans MT" w:hAnsi="Gill Sans MT"/>
+          <w:b/>
+          <w:sz w:val="20"/>
+          <w:szCs w:val="20"/>
+        </w:rPr>
+        <w:tab/>
+        <w:t>0</w:t>
+      </w:r>
+      <w:r>
+        <w:rPr>
+          <w:rFonts w:ascii="Gill Sans MT" w:hAnsi="Gill Sans MT"/>
+          <w:b/>
+          <w:sz w:val="20"/>
+          <w:szCs w:val="20"/>
+        </w:rPr>
+        <w:t>6</w:t>
+      </w:r>
+      <w:r>
+        <w:rPr>
+          <w:rFonts w:ascii="Gill Sans MT" w:hAnsi="Gill Sans MT"/>
+          <w:b/>
+          <w:sz w:val="20"/>
+          <w:szCs w:val="20"/>
+        </w:rPr>
+        <w:t>/202</w:t>
+      </w:r>
+      <w:r>
+        <w:rPr>
+          <w:rFonts w:ascii="Gill Sans MT" w:hAnsi="Gill Sans MT"/>
+          <w:b/>
+          <w:sz w:val="20"/>
+          <w:szCs w:val="20"/>
+        </w:rPr>
+        <w:t>1</w:t>
+      </w:r>
+      <w:r>
+        <w:rPr>
+          <w:rFonts w:ascii="Gill Sans MT" w:hAnsi="Gill Sans MT"/>
+          <w:b/>
+          <w:sz w:val="20"/>
+          <w:szCs w:val="20"/>
+        </w:rPr>
+        <w:t>-</w:t>
+      </w:r>
+      <w:r>
+        <w:rPr>
+          <w:rFonts w:ascii="Gill Sans MT" w:hAnsi="Gill Sans MT"/>
+          <w:b/>
+          <w:sz w:val="20"/>
+          <w:szCs w:val="20"/>
+        </w:rPr>
+        <w:t>04/2022</w:t>
+      </w:r>
+    </w:p>
+    <w:p>
+      <w:pPr>
+        <w:pStyle w:val="ListParagraph"/>
+        <w:numPr>
+          <w:ilvl w:val="0"/>
+          <w:numId w:val="3"/>
+        </w:numPr>
+        <w:tabs>
+          <w:tab w:val="right" w:pos="10800"/>
+        </w:tabs>
+        <w:spacing w:before="120" w:after="0" w:line="228" w:lineRule="auto"/>
+        <w:rPr>
+          <w:rFonts w:ascii="Gill Sans MT" w:hAnsi="Gill Sans MT"/>
+          <w:sz w:val="20"/>
+          <w:szCs w:val="20"/>
+        </w:rPr>
+      </w:pPr>
+      <w:r>
+        <w:rPr>
+          <w:rFonts w:ascii="Gill Sans MT" w:hAnsi="Gill Sans MT"/>
+          <w:sz w:val="20"/>
+          <w:szCs w:val="20"/>
+        </w:rPr>
+        <w:t xml:space="preserve">Built a machine learning tool using Python &amp; Amazon </w:t>
+      </w:r>
+      <w:proofErr w:type="spellStart"/>
+      <w:r>
+        <w:rPr>
+          <w:rFonts w:ascii="Gill Sans MT" w:hAnsi="Gill Sans MT"/>
+          <w:sz w:val="20"/>
+          <w:szCs w:val="20"/>
+        </w:rPr>
+        <w:t>Textract</w:t>
+      </w:r>
+      <w:proofErr w:type="spellEnd"/>
+      <w:r>
+        <w:rPr>
+          <w:rFonts w:ascii="Gill Sans MT" w:hAnsi="Gill Sans MT"/>
+          <w:sz w:val="20"/>
+          <w:szCs w:val="20"/>
+        </w:rPr>
+        <w:t>, automating key data extraction from insurance documents &amp; accelerating CRM workflows.</w:t>
+      </w:r>
+    </w:p>
+    <w:p>
+      <w:pPr>
+        <w:pStyle w:val="ListParagraph"/>
+        <w:numPr>
+          <w:ilvl w:val="0"/>
+          <w:numId w:val="3"/>
+        </w:numPr>
+        <w:tabs>
+          <w:tab w:val="right" w:pos="10800"/>
+        </w:tabs>
+        <w:spacing w:before="120" w:after="0" w:line="228" w:lineRule="auto"/>
+        <w:rPr>
+          <w:rFonts w:ascii="Gill Sans MT" w:hAnsi="Gill Sans MT"/>
+          <w:sz w:val="20"/>
+          <w:szCs w:val="20"/>
+        </w:rPr>
+      </w:pPr>
+      <w:r>
+        <w:rPr>
+          <w:rFonts w:ascii="Gill Sans MT" w:hAnsi="Gill Sans MT"/>
+          <w:sz w:val="20"/>
+          <w:szCs w:val="20"/>
+        </w:rPr>
+        <w:t>Led end-to-end development, from technical design to implementation.</w:t>
+      </w:r>
+    </w:p>
+    <w:p>
+      <w:pPr>
+        <w:pStyle w:val="ListParagraph"/>
+        <w:numPr>
+          <w:ilvl w:val="0"/>
+          <w:numId w:val="3"/>
+        </w:numPr>
+        <w:tabs>
+          <w:tab w:val="right" w:pos="10800"/>
+        </w:tabs>
+        <w:spacing w:before="120" w:after="0" w:line="228" w:lineRule="auto"/>
+        <w:rPr>
+          <w:rFonts w:ascii="Gill Sans MT" w:hAnsi="Gill Sans MT"/>
+          <w:sz w:val="20"/>
+          <w:szCs w:val="20"/>
+        </w:rPr>
+      </w:pPr>
+      <w:r>
+        <w:rPr>
+          <w:rFonts w:ascii="Gill Sans MT" w:hAnsi="Gill Sans MT"/>
+          <w:sz w:val="20"/>
+          <w:szCs w:val="20"/>
+        </w:rPr>
+        <w:t>Delivered accurate project estimates &amp; managed the full software lifecycle.</w:t>
+      </w:r>
+    </w:p>
+    <w:p>
+      <w:pPr>
+        <w:pStyle w:val="ListParagraph"/>
+        <w:numPr>
+          <w:ilvl w:val="0"/>
+          <w:numId w:val="3"/>
+        </w:numPr>
+        <w:tabs>
+          <w:tab w:val="right" w:pos="10800"/>
+        </w:tabs>
+        <w:spacing w:before="120" w:after="0" w:line="228" w:lineRule="auto"/>
+        <w:rPr>
+          <w:rFonts w:ascii="Gill Sans MT" w:hAnsi="Gill Sans MT"/>
+          <w:sz w:val="20"/>
+          <w:szCs w:val="20"/>
+        </w:rPr>
+      </w:pPr>
+      <w:r>
+        <w:rPr>
+          <w:rFonts w:ascii="Gill Sans MT" w:hAnsi="Gill Sans MT"/>
+          <w:sz w:val="20"/>
+          <w:szCs w:val="20"/>
+        </w:rPr>
+        <w:t xml:space="preserve">Developed a document annotation system in Java Spring Boot &amp; </w:t>
+      </w:r>
+      <w:proofErr w:type="spellStart"/>
+      <w:r>
+        <w:rPr>
+          <w:rFonts w:ascii="Gill Sans MT" w:hAnsi="Gill Sans MT"/>
+          <w:sz w:val="20"/>
+          <w:szCs w:val="20"/>
+        </w:rPr>
+        <w:t>Annotorious</w:t>
+      </w:r>
+      <w:proofErr w:type="spellEnd"/>
+      <w:r>
+        <w:rPr>
+          <w:rFonts w:ascii="Gill Sans MT" w:hAnsi="Gill Sans MT"/>
+          <w:sz w:val="20"/>
+          <w:szCs w:val="20"/>
+        </w:rPr>
+        <w:t>, streamlining ML model training for domain experts.</w:t>
+      </w:r>
+    </w:p>
+    <w:p>
+      <w:pPr>
+        <w:tabs>
+          <w:tab w:val="right" w:pos="10800"/>
+        </w:tabs>
+        <w:spacing w:before="120" w:after="0" w:line="228" w:lineRule="auto"/>
+        <w:rPr>
+          <w:rFonts w:ascii="Gill Sans MT" w:hAnsi="Gill Sans MT"/>
+          <w:sz w:val="20"/>
+          <w:szCs w:val="20"/>
+        </w:rPr>
+      </w:pPr>
+    </w:p>
+    <w:p>
+      <w:pPr>
+        <w:tabs>
+          <w:tab w:val="right" w:pos="10800"/>
+        </w:tabs>
+        <w:spacing w:before="120" w:after="0" w:line="228" w:lineRule="auto"/>
+        <w:rPr>
+          <w:rFonts w:ascii="Gill Sans MT" w:hAnsi="Gill Sans MT"/>
+          <w:b/>
+          <w:sz w:val="20"/>
+          <w:szCs w:val="20"/>
+        </w:rPr>
+      </w:pPr>
+      <w:proofErr w:type="spellStart"/>
+      <w:r>
+        <w:rPr>
+          <w:rFonts w:ascii="Gill Sans MT" w:hAnsi="Gill Sans MT"/>
+          <w:b/>
+          <w:sz w:val="20"/>
+          <w:szCs w:val="20"/>
+          <w:u w:val="single"/>
+        </w:rPr>
+        <w:t>Akmazio</w:t>
+      </w:r>
+      <w:proofErr w:type="spellEnd"/>
+      <w:r>
+        <w:rPr>
+          <w:rFonts w:ascii="Gill Sans MT" w:hAnsi="Gill Sans MT"/>
+          <w:b/>
+          <w:sz w:val="20"/>
+          <w:szCs w:val="20"/>
+          <w:u w:val="single"/>
+        </w:rPr>
+        <w:t xml:space="preserve"> LLC</w:t>
+      </w:r>
+      <w:r>
+        <w:rPr>
+          <w:rFonts w:ascii="Gill Sans MT" w:hAnsi="Gill Sans MT"/>
+          <w:sz w:val="20"/>
+          <w:szCs w:val="20"/>
+        </w:rPr>
+        <w:tab/>
+      </w:r>
+      <w:r>
+        <w:rPr>
+          <w:rFonts w:ascii="Gill Sans MT" w:hAnsi="Gill Sans MT"/>
+          <w:b/>
+          <w:sz w:val="20"/>
+          <w:szCs w:val="20"/>
+        </w:rPr>
+        <w:t>Albany, NY</w:t>
+      </w:r>
+    </w:p>
+    <w:p>
+      <w:pPr>
+        <w:shd w:val="clear" w:color="auto" w:fill="F2F2F2" w:themeFill="background1" w:themeFillShade="F2"/>
+        <w:tabs>
+          <w:tab w:val="right" w:pos="8928"/>
+          <w:tab w:val="right" w:pos="11520"/>
+        </w:tabs>
+        <w:spacing w:after="80" w:line="228" w:lineRule="auto"/>
+        <w:rPr>
+          <w:rFonts w:ascii="Gill Sans MT" w:hAnsi="Gill Sans MT"/>
+          <w:b/>
+          <w:sz w:val="20"/>
+          <w:szCs w:val="20"/>
+        </w:rPr>
+      </w:pPr>
+      <w:r>
+        <w:rPr>
+          <w:rFonts w:ascii="Gill Sans MT" w:hAnsi="Gill Sans MT"/>
+          <w:b/>
+          <w:sz w:val="20"/>
+          <w:szCs w:val="20"/>
+        </w:rPr>
+        <w:t>Senior Software Engineer</w:t>
+      </w:r>
+      <w:r>
+        <w:rPr>
+          <w:rFonts w:ascii="Gill Sans MT" w:hAnsi="Gill Sans MT"/>
+          <w:b/>
+          <w:sz w:val="20"/>
+          <w:szCs w:val="20"/>
+        </w:rPr>
+        <w:tab/>
+      </w:r>
+      <w:r>
+        <w:rPr>
+          <w:rFonts w:ascii="Gill Sans MT" w:hAnsi="Gill Sans MT"/>
+          <w:b/>
+          <w:sz w:val="20"/>
+          <w:szCs w:val="20"/>
+        </w:rPr>
+        <w:tab/>
+      </w:r>
+      <w:r>
+        <w:rPr>
+          <w:rFonts w:ascii="Gill Sans MT" w:hAnsi="Gill Sans MT"/>
+          <w:b/>
+          <w:sz w:val="20"/>
+          <w:szCs w:val="20"/>
+        </w:rPr>
+        <w:t>0</w:t>
+      </w:r>
+      <w:r>
+        <w:rPr>
+          <w:rFonts w:ascii="Gill Sans MT" w:hAnsi="Gill Sans MT"/>
+          <w:b/>
+          <w:sz w:val="20"/>
+          <w:szCs w:val="20"/>
+        </w:rPr>
+        <w:t>5</w:t>
+      </w:r>
+      <w:r>
+        <w:rPr>
+          <w:rFonts w:ascii="Gill Sans MT" w:hAnsi="Gill Sans MT"/>
+          <w:b/>
+          <w:sz w:val="20"/>
+          <w:szCs w:val="20"/>
+        </w:rPr>
+        <w:t>/2020-</w:t>
+      </w:r>
+      <w:r>
+        <w:rPr>
+          <w:rFonts w:ascii="Gill Sans MT" w:hAnsi="Gill Sans MT"/>
+          <w:b/>
+          <w:sz w:val="20"/>
+          <w:szCs w:val="20"/>
+        </w:rPr>
+        <w:t>05/2021</w:t>
+      </w:r>
+    </w:p>
+    <w:p>
+      <w:pPr>
+        <w:pStyle w:val="ListParagraph"/>
+        <w:numPr>
+          <w:ilvl w:val="0"/>
+          <w:numId w:val="3"/>
+        </w:numPr>
+        <w:tabs>
+          <w:tab w:val="right" w:pos="10800"/>
+        </w:tabs>
+        <w:spacing w:before="120" w:after="0" w:line="228" w:lineRule="auto"/>
+        <w:rPr>
+          <w:rFonts w:ascii="Gill Sans MT" w:hAnsi="Gill Sans MT"/>
+          <w:sz w:val="20"/>
+          <w:szCs w:val="20"/>
+        </w:rPr>
+      </w:pPr>
+      <w:r>
+        <w:rPr>
+          <w:rFonts w:ascii="Gill Sans MT" w:hAnsi="Gill Sans MT"/>
+          <w:sz w:val="20"/>
+          <w:szCs w:val="20"/>
+        </w:rPr>
+        <w:t>Led a team as Scrum Master, facilitating sprints, stand-ups, sprint planning, and retrospectives.</w:t>
+      </w:r>
+    </w:p>
+    <w:p>
+      <w:pPr>
+        <w:pStyle w:val="ListParagraph"/>
+        <w:numPr>
+          <w:ilvl w:val="0"/>
+          <w:numId w:val="3"/>
+        </w:numPr>
+        <w:tabs>
+          <w:tab w:val="right" w:pos="10800"/>
+        </w:tabs>
+        <w:spacing w:before="120" w:after="0" w:line="228" w:lineRule="auto"/>
+        <w:rPr>
+          <w:rFonts w:ascii="Gill Sans MT" w:hAnsi="Gill Sans MT"/>
+          <w:sz w:val="20"/>
+          <w:szCs w:val="20"/>
+        </w:rPr>
+      </w:pPr>
+      <w:r>
+        <w:rPr>
+          <w:rFonts w:ascii="Gill Sans MT" w:hAnsi="Gill Sans MT"/>
+          <w:sz w:val="20"/>
+          <w:szCs w:val="20"/>
+        </w:rPr>
+        <w:t xml:space="preserve">Designed &amp; developed </w:t>
+      </w:r>
+      <w:proofErr w:type="spellStart"/>
+      <w:r>
+        <w:rPr>
+          <w:rFonts w:ascii="Gill Sans MT" w:hAnsi="Gill Sans MT"/>
+          <w:sz w:val="20"/>
+          <w:szCs w:val="20"/>
+        </w:rPr>
+        <w:t>Flouriish</w:t>
+      </w:r>
+      <w:proofErr w:type="spellEnd"/>
+      <w:r>
+        <w:rPr>
+          <w:rFonts w:ascii="Gill Sans MT" w:hAnsi="Gill Sans MT"/>
+          <w:sz w:val="20"/>
+          <w:szCs w:val="20"/>
+        </w:rPr>
+        <w:t>, a mobile networking platform connecting financial advisors with small business leads.</w:t>
+      </w:r>
+    </w:p>
+    <w:p>
+      <w:pPr>
+        <w:pStyle w:val="ListParagraph"/>
+        <w:numPr>
+          <w:ilvl w:val="0"/>
+          <w:numId w:val="3"/>
+        </w:numPr>
+        <w:tabs>
+          <w:tab w:val="right" w:pos="10800"/>
+        </w:tabs>
+        <w:spacing w:before="120" w:after="0" w:line="228" w:lineRule="auto"/>
+        <w:rPr>
+          <w:rFonts w:ascii="Gill Sans MT" w:hAnsi="Gill Sans MT"/>
+          <w:sz w:val="20"/>
+          <w:szCs w:val="20"/>
+        </w:rPr>
+      </w:pPr>
+      <w:r>
+        <w:rPr>
+          <w:rFonts w:ascii="Gill Sans MT" w:hAnsi="Gill Sans MT"/>
+          <w:sz w:val="20"/>
+          <w:szCs w:val="20"/>
+        </w:rPr>
+        <w:t>Engaged 12+ financial advisors &amp; business owners for beta testing pre-launch.</w:t>
+      </w:r>
+    </w:p>
+    <w:p>
+      <w:pPr>
+        <w:pStyle w:val="ListParagraph"/>
+        <w:numPr>
+          <w:ilvl w:val="0"/>
+          <w:numId w:val="3"/>
+        </w:numPr>
+        <w:tabs>
+          <w:tab w:val="right" w:pos="10800"/>
+        </w:tabs>
+        <w:spacing w:before="120" w:after="0" w:line="228" w:lineRule="auto"/>
+        <w:rPr>
+          <w:rFonts w:ascii="Gill Sans MT" w:hAnsi="Gill Sans MT"/>
+          <w:sz w:val="20"/>
+          <w:szCs w:val="20"/>
+        </w:rPr>
+      </w:pPr>
+      <w:r>
+        <w:rPr>
+          <w:rFonts w:ascii="Gill Sans MT" w:hAnsi="Gill Sans MT"/>
+          <w:sz w:val="20"/>
+          <w:szCs w:val="20"/>
+        </w:rPr>
+        <w:t>Built &amp; implemented MS SQL database architecture and a C# Web API to power the React Native frontend.</w:t>
+      </w:r>
+    </w:p>
+    <w:p>
+      <w:pPr>
+        <w:pStyle w:val="ListParagraph"/>
+        <w:numPr>
+          <w:ilvl w:val="0"/>
+          <w:numId w:val="3"/>
+        </w:numPr>
+        <w:tabs>
+          <w:tab w:val="right" w:pos="10800"/>
+        </w:tabs>
+        <w:spacing w:before="120" w:after="0" w:line="228" w:lineRule="auto"/>
+        <w:rPr>
+          <w:rFonts w:ascii="Gill Sans MT" w:hAnsi="Gill Sans MT"/>
+          <w:sz w:val="20"/>
+          <w:szCs w:val="20"/>
+        </w:rPr>
+      </w:pPr>
+      <w:r>
+        <w:rPr>
+          <w:rFonts w:ascii="Gill Sans MT" w:hAnsi="Gill Sans MT"/>
+          <w:sz w:val="20"/>
+          <w:szCs w:val="20"/>
+        </w:rPr>
+        <w:t xml:space="preserve">Standardized server infrastructure using </w:t>
+      </w:r>
+      <w:proofErr w:type="spellStart"/>
+      <w:r>
+        <w:rPr>
+          <w:rFonts w:ascii="Gill Sans MT" w:hAnsi="Gill Sans MT"/>
+          <w:sz w:val="20"/>
+          <w:szCs w:val="20"/>
+        </w:rPr>
+        <w:t>DigitalOcean</w:t>
+      </w:r>
+      <w:proofErr w:type="spellEnd"/>
+      <w:r>
+        <w:rPr>
+          <w:rFonts w:ascii="Gill Sans MT" w:hAnsi="Gill Sans MT"/>
+          <w:sz w:val="20"/>
+          <w:szCs w:val="20"/>
+        </w:rPr>
+        <w:t>, Cloudflare, Ubuntu, .NET Core, GitHub, &amp; custom bash scripting.</w:t>
+      </w:r>
+    </w:p>
+    <w:p>
+      <w:pPr>
+        <w:tabs>
+          <w:tab w:val="right" w:pos="10800"/>
+        </w:tabs>
+        <w:spacing w:before="120" w:after="0" w:line="228" w:lineRule="auto"/>
+        <w:rPr>
+          <w:rFonts w:ascii="Gill Sans MT" w:hAnsi="Gill Sans MT"/>
+          <w:sz w:val="20"/>
+          <w:szCs w:val="20"/>
+        </w:rPr>
+      </w:pPr>
+    </w:p>
+    <w:p>
+      <w:pPr>
+        <w:tabs>
+          <w:tab w:val="right" w:pos="10800"/>
+        </w:tabs>
+        <w:spacing w:before="120" w:after="0" w:line="228" w:lineRule="auto"/>
+        <w:rPr>
+          <w:rFonts w:ascii="Gill Sans MT" w:hAnsi="Gill Sans MT"/>
+          <w:b/>
+          <w:sz w:val="20"/>
+          <w:szCs w:val="20"/>
+        </w:rPr>
+      </w:pPr>
+      <w:proofErr w:type="spellStart"/>
+      <w:r>
+        <w:rPr>
+          <w:rFonts w:ascii="Gill Sans MT" w:hAnsi="Gill Sans MT"/>
+          <w:b/>
+          <w:sz w:val="20"/>
+          <w:szCs w:val="20"/>
+          <w:u w:val="single"/>
+        </w:rPr>
+        <w:t>Bestpass</w:t>
+      </w:r>
+      <w:proofErr w:type="spellEnd"/>
+      <w:r>
+        <w:rPr>
+          <w:rFonts w:ascii="Gill Sans MT" w:hAnsi="Gill Sans MT"/>
+          <w:b/>
+          <w:sz w:val="20"/>
+          <w:szCs w:val="20"/>
+          <w:u w:val="single"/>
+        </w:rPr>
+        <w:t>, Inc.</w:t>
+      </w:r>
+      <w:r>
+        <w:rPr>
+          <w:rFonts w:ascii="Gill Sans MT" w:hAnsi="Gill Sans MT"/>
+          <w:sz w:val="20"/>
+          <w:szCs w:val="20"/>
+        </w:rPr>
+        <w:tab/>
+      </w:r>
+      <w:r>
+        <w:rPr>
+          <w:rFonts w:ascii="Gill Sans MT" w:hAnsi="Gill Sans MT"/>
+          <w:b/>
+          <w:sz w:val="20"/>
+          <w:szCs w:val="20"/>
+        </w:rPr>
+        <w:t>Albany, NY</w:t>
+      </w:r>
+    </w:p>
+    <w:p>
+      <w:pPr>
+        <w:shd w:val="clear" w:color="auto" w:fill="F2F2F2" w:themeFill="background1" w:themeFillShade="F2"/>
+        <w:tabs>
+          <w:tab w:val="right" w:pos="8928"/>
+          <w:tab w:val="right" w:pos="11520"/>
+        </w:tabs>
+        <w:spacing w:after="80" w:line="228" w:lineRule="auto"/>
+        <w:rPr>
+          <w:rFonts w:ascii="Gill Sans MT" w:hAnsi="Gill Sans MT"/>
+          <w:b/>
+          <w:sz w:val="20"/>
+          <w:szCs w:val="20"/>
+        </w:rPr>
+      </w:pPr>
+      <w:r>
+        <w:rPr>
+          <w:rFonts w:ascii="Gill Sans MT" w:hAnsi="Gill Sans MT"/>
+          <w:b/>
+          <w:sz w:val="20"/>
+          <w:szCs w:val="20"/>
+        </w:rPr>
+        <w:t xml:space="preserve">Software Engineer </w:t>
+      </w:r>
+      <w:r>
+        <w:rPr>
+          <w:rFonts w:ascii="Gill Sans MT" w:hAnsi="Gill Sans MT"/>
+          <w:b/>
+          <w:sz w:val="20"/>
+          <w:szCs w:val="20"/>
+        </w:rPr>
+        <w:tab/>
+      </w:r>
+      <w:r>
+        <w:rPr>
+          <w:rFonts w:ascii="Gill Sans MT" w:hAnsi="Gill Sans MT"/>
+          <w:b/>
+          <w:sz w:val="20"/>
+          <w:szCs w:val="20"/>
+        </w:rPr>
+        <w:tab/>
+        <w:t>09/2019-04/2020</w:t>
+      </w:r>
+    </w:p>
+    <w:p>
+      <w:pPr>
+        <w:pStyle w:val="ListParagraph"/>
+        <w:numPr>
+          <w:ilvl w:val="0"/>
+          <w:numId w:val="3"/>
+        </w:numPr>
+        <w:tabs>
+          <w:tab w:val="right" w:pos="10800"/>
+        </w:tabs>
+        <w:spacing w:before="120" w:after="0" w:line="228" w:lineRule="auto"/>
+        <w:rPr>
+          <w:rFonts w:ascii="Gill Sans MT" w:hAnsi="Gill Sans MT"/>
+          <w:sz w:val="20"/>
+          <w:szCs w:val="20"/>
+        </w:rPr>
+      </w:pPr>
+      <w:r>
+        <w:rPr>
+          <w:rFonts w:ascii="Gill Sans MT" w:hAnsi="Gill Sans MT"/>
+          <w:sz w:val="20"/>
+          <w:szCs w:val="20"/>
+        </w:rPr>
+        <w:t>Actively contributed to Scrum processes, participating in sprints &amp; ceremonies.</w:t>
+      </w:r>
+    </w:p>
+    <w:p>
+      <w:pPr>
+        <w:pStyle w:val="ListParagraph"/>
+        <w:numPr>
+          <w:ilvl w:val="0"/>
+          <w:numId w:val="3"/>
+        </w:numPr>
+        <w:tabs>
+          <w:tab w:val="right" w:pos="10800"/>
+        </w:tabs>
+        <w:spacing w:before="120" w:after="0" w:line="228" w:lineRule="auto"/>
+        <w:rPr>
+          <w:rFonts w:ascii="Gill Sans MT" w:hAnsi="Gill Sans MT"/>
+          <w:sz w:val="20"/>
+          <w:szCs w:val="20"/>
+        </w:rPr>
+      </w:pPr>
+      <w:r>
+        <w:rPr>
+          <w:rFonts w:ascii="Gill Sans MT" w:hAnsi="Gill Sans MT"/>
+          <w:sz w:val="20"/>
+          <w:szCs w:val="20"/>
+        </w:rPr>
+        <w:t>Designed &amp; implemented high-quality software architecture, prioritizing &amp; executing tasks across the SDLC.</w:t>
+      </w:r>
+    </w:p>
+    <w:p>
+      <w:pPr>
+        <w:pStyle w:val="ListParagraph"/>
+        <w:numPr>
+          <w:ilvl w:val="0"/>
+          <w:numId w:val="3"/>
+        </w:numPr>
+        <w:tabs>
+          <w:tab w:val="right" w:pos="10800"/>
+        </w:tabs>
+        <w:spacing w:before="120" w:after="0" w:line="228" w:lineRule="auto"/>
+        <w:rPr>
+          <w:rFonts w:ascii="Gill Sans MT" w:hAnsi="Gill Sans MT"/>
+          <w:sz w:val="20"/>
+          <w:szCs w:val="20"/>
+        </w:rPr>
+      </w:pPr>
+      <w:r>
+        <w:rPr>
+          <w:rFonts w:ascii="Gill Sans MT" w:hAnsi="Gill Sans MT"/>
+          <w:sz w:val="20"/>
+          <w:szCs w:val="20"/>
+        </w:rPr>
+        <w:t>Developed a toll bill consolidation system for trucking companies, organizing costs by cost center.</w:t>
+      </w:r>
+    </w:p>
+    <w:p>
+      <w:pPr>
+        <w:pStyle w:val="ListParagraph"/>
+        <w:numPr>
+          <w:ilvl w:val="0"/>
+          <w:numId w:val="3"/>
+        </w:numPr>
+        <w:tabs>
+          <w:tab w:val="right" w:pos="10800"/>
+        </w:tabs>
+        <w:spacing w:before="120" w:after="0" w:line="228" w:lineRule="auto"/>
+        <w:rPr>
+          <w:rFonts w:ascii="Gill Sans MT" w:hAnsi="Gill Sans MT"/>
+          <w:sz w:val="20"/>
+          <w:szCs w:val="20"/>
+        </w:rPr>
+      </w:pPr>
+      <w:r>
+        <w:rPr>
+          <w:rFonts w:ascii="Gill Sans MT" w:hAnsi="Gill Sans MT"/>
+          <w:sz w:val="20"/>
+          <w:szCs w:val="20"/>
+        </w:rPr>
+        <w:t>Enhanced and maintained a C# MVC &amp; Knockout.js web app, along with MS SQL stored procedures.</w:t>
+      </w:r>
+    </w:p>
+    <w:p>
+      <w:pPr>
+        <w:pStyle w:val="ListParagraph"/>
+        <w:numPr>
+          <w:ilvl w:val="0"/>
+          <w:numId w:val="3"/>
+        </w:numPr>
+        <w:tabs>
+          <w:tab w:val="right" w:pos="10800"/>
+        </w:tabs>
+        <w:spacing w:before="120" w:after="0" w:line="228" w:lineRule="auto"/>
+        <w:rPr>
+          <w:rFonts w:ascii="Gill Sans MT" w:hAnsi="Gill Sans MT"/>
+          <w:sz w:val="20"/>
+          <w:szCs w:val="20"/>
+        </w:rPr>
+      </w:pPr>
+      <w:r>
+        <w:rPr>
+          <w:rFonts w:ascii="Gill Sans MT" w:hAnsi="Gill Sans MT"/>
+          <w:sz w:val="20"/>
+          <w:szCs w:val="20"/>
+        </w:rPr>
+        <w:t>Improved legacy code quality by integrating automated unit tests to boost code coverage.</w:t>
+      </w:r>
+    </w:p>
+    <w:p>
+      <w:pPr>
+        <w:tabs>
+          <w:tab w:val="right" w:pos="10800"/>
+        </w:tabs>
+        <w:spacing w:before="120" w:after="0" w:line="228" w:lineRule="auto"/>
+        <w:rPr>
+          <w:rFonts w:ascii="Gill Sans MT" w:hAnsi="Gill Sans MT"/>
+          <w:sz w:val="20"/>
+          <w:szCs w:val="20"/>
+        </w:rPr>
+      </w:pPr>
+    </w:p>
+    <w:p>
+      <w:pPr>
+        <w:tabs>
+          <w:tab w:val="right" w:pos="10800"/>
+        </w:tabs>
+        <w:spacing w:before="120" w:after="0" w:line="228" w:lineRule="auto"/>
+        <w:rPr>
+          <w:rFonts w:ascii="Gill Sans MT" w:hAnsi="Gill Sans MT"/>
+          <w:b/>
+          <w:sz w:val="20"/>
+          <w:szCs w:val="20"/>
+        </w:rPr>
+      </w:pPr>
+      <w:r>
+        <w:rPr>
+          <w:rFonts w:ascii="Gill Sans MT" w:hAnsi="Gill Sans MT"/>
+          <w:b/>
+          <w:sz w:val="20"/>
+          <w:szCs w:val="20"/>
+          <w:u w:val="single"/>
+        </w:rPr>
+        <w:t>New York State Insurance Fund</w:t>
+      </w:r>
+      <w:r>
+        <w:rPr>
+          <w:rFonts w:ascii="Gill Sans MT" w:hAnsi="Gill Sans MT"/>
+          <w:sz w:val="20"/>
+          <w:szCs w:val="20"/>
+        </w:rPr>
+        <w:tab/>
+      </w:r>
+      <w:r>
+        <w:rPr>
+          <w:rFonts w:ascii="Gill Sans MT" w:hAnsi="Gill Sans MT"/>
+          <w:b/>
+          <w:sz w:val="20"/>
+          <w:szCs w:val="20"/>
+        </w:rPr>
+        <w:t>Albany, NY</w:t>
+      </w:r>
+    </w:p>
+    <w:p>
+      <w:pPr>
+        <w:shd w:val="clear" w:color="auto" w:fill="F2F2F2" w:themeFill="background1" w:themeFillShade="F2"/>
+        <w:tabs>
+          <w:tab w:val="right" w:pos="8928"/>
+          <w:tab w:val="right" w:pos="11520"/>
+        </w:tabs>
+        <w:spacing w:after="80" w:line="228" w:lineRule="auto"/>
+        <w:rPr>
+          <w:rFonts w:ascii="Gill Sans MT" w:hAnsi="Gill Sans MT"/>
+          <w:b/>
+          <w:sz w:val="20"/>
+          <w:szCs w:val="20"/>
+        </w:rPr>
+      </w:pPr>
+      <w:r>
+        <w:rPr>
+          <w:rFonts w:ascii="Gill Sans MT" w:hAnsi="Gill Sans MT"/>
+          <w:b/>
+          <w:sz w:val="20"/>
+          <w:szCs w:val="20"/>
+        </w:rPr>
+        <w:t xml:space="preserve">Software </w:t>
+      </w:r>
+      <w:r>
+        <w:rPr>
+          <w:rFonts w:ascii="Gill Sans MT" w:hAnsi="Gill Sans MT"/>
+          <w:b/>
+          <w:sz w:val="20"/>
+          <w:szCs w:val="20"/>
+        </w:rPr>
+        <w:t>Engineer</w:t>
+      </w:r>
+      <w:r>
+        <w:rPr>
+          <w:rFonts w:ascii="Gill Sans MT" w:hAnsi="Gill Sans MT"/>
+          <w:b/>
+          <w:sz w:val="20"/>
+          <w:szCs w:val="20"/>
+        </w:rPr>
+        <w:t xml:space="preserve"> </w:t>
+      </w:r>
+      <w:r>
+        <w:rPr>
+          <w:rFonts w:ascii="Gill Sans MT" w:hAnsi="Gill Sans MT"/>
+          <w:b/>
+          <w:sz w:val="20"/>
+          <w:szCs w:val="20"/>
+        </w:rPr>
+        <w:tab/>
+      </w:r>
+      <w:r>
+        <w:rPr>
+          <w:rFonts w:ascii="Gill Sans MT" w:hAnsi="Gill Sans MT"/>
+          <w:b/>
+          <w:sz w:val="20"/>
+          <w:szCs w:val="20"/>
+        </w:rPr>
+        <w:tab/>
+        <w:t>03/2015-08/2019</w:t>
       </w:r>
     </w:p>
     <w:p>
@@ -2609,7 +3188,7 @@
           <w:sz w:val="20"/>
           <w:szCs w:val="20"/>
         </w:rPr>
-        <w:t>Designed and implemented system improvements, optimizing performance and maintainability.</w:t>
+        <w:t>Improved system quality by identifying issues, standardizing processes, and developing SOPs.</w:t>
       </w:r>
     </w:p>
     <w:p>
@@ -2632,7 +3211,7 @@
           <w:sz w:val="20"/>
           <w:szCs w:val="20"/>
         </w:rPr>
-        <w:t>Maintained and enhanced existing codebases, collaborating on technical designs.</w:t>
+        <w:t>Designed and implemented system improvements, optimizing performance and maintainability.</w:t>
       </w:r>
     </w:p>
     <w:p>
@@ -2655,7 +3234,7 @@
           <w:sz w:val="20"/>
           <w:szCs w:val="20"/>
         </w:rPr>
-        <w:t>Trained junior developers in C# MVC, HTML, CSS, JavaScript, Bootstrap, and jQuery.</w:t>
+        <w:t>Maintained and enhanced existing codebases, collaborating on technical designs.</w:t>
       </w:r>
     </w:p>
     <w:p>
@@ -2678,7 +3257,7 @@
           <w:sz w:val="20"/>
           <w:szCs w:val="20"/>
         </w:rPr>
-        <w:t>Migrated a VB6 project to C# MVC, preserving UI/UX to eliminate retraining.</w:t>
+        <w:t>Trained junior developers in C# MVC, HTML, CSS, JavaScript, Bootstrap, and jQuery.</w:t>
       </w:r>
     </w:p>
     <w:p>
@@ -2701,7 +3280,7 @@
           <w:sz w:val="20"/>
           <w:szCs w:val="20"/>
         </w:rPr>
-        <w:t>Refactored an Oracle PL/SQL EDI system, introducing decision tree-driven business logic.</w:t>
+        <w:t>Migrated a VB6 project to C# MVC, preserving UI/UX to eliminate retraining.</w:t>
       </w:r>
     </w:p>
     <w:p>
@@ -2724,137 +3303,7 @@
           <w:sz w:val="20"/>
           <w:szCs w:val="20"/>
         </w:rPr>
-        <w:t>Automated a code production process, reducing task completion time from 6-8 weeks to 2-3 minutes.</w:t>
-      </w:r>
-    </w:p>
-    <w:p>
-      <w:pPr>
-        <w:spacing w:after="0" w:line="228" w:lineRule="auto"/>
-        <w:rPr>
-          <w:rFonts w:ascii="Gill Sans MT" w:hAnsi="Gill Sans MT"/>
-          <w:sz w:val="20"/>
-          <w:szCs w:val="20"/>
-        </w:rPr>
-      </w:pPr>
-    </w:p>
-    <w:p>
-      <w:pPr>
-        <w:tabs>
-          <w:tab w:val="right" w:pos="10800"/>
-        </w:tabs>
-        <w:spacing w:before="120" w:after="0" w:line="228" w:lineRule="auto"/>
-        <w:rPr>
-          <w:rFonts w:ascii="Gill Sans MT" w:hAnsi="Gill Sans MT"/>
-          <w:b/>
-          <w:sz w:val="20"/>
-          <w:szCs w:val="20"/>
-        </w:rPr>
-      </w:pPr>
-      <w:r>
-        <w:rPr>
-          <w:rFonts w:ascii="Gill Sans MT" w:hAnsi="Gill Sans MT"/>
-          <w:b/>
-          <w:sz w:val="20"/>
-          <w:szCs w:val="20"/>
-          <w:u w:val="single"/>
-        </w:rPr>
-        <w:t>Town &amp; Country Computer Services</w:t>
-      </w:r>
-      <w:r>
-        <w:rPr>
-          <w:rFonts w:ascii="Gill Sans MT" w:hAnsi="Gill Sans MT"/>
-          <w:sz w:val="20"/>
-          <w:szCs w:val="20"/>
-        </w:rPr>
-        <w:tab/>
-      </w:r>
-      <w:r>
-        <w:rPr>
-          <w:rFonts w:ascii="Gill Sans MT" w:hAnsi="Gill Sans MT"/>
-          <w:b/>
-          <w:sz w:val="20"/>
-          <w:szCs w:val="20"/>
-        </w:rPr>
-        <w:t>Schenectady</w:t>
-      </w:r>
-      <w:r>
-        <w:rPr>
-          <w:rFonts w:ascii="Gill Sans MT" w:hAnsi="Gill Sans MT"/>
-          <w:b/>
-          <w:sz w:val="20"/>
-          <w:szCs w:val="20"/>
-        </w:rPr>
-        <w:t>, NY</w:t>
-      </w:r>
-    </w:p>
-    <w:p>
-      <w:pPr>
-        <w:shd w:val="clear" w:color="auto" w:fill="F2F2F2" w:themeFill="background1" w:themeFillShade="F2"/>
-        <w:tabs>
-          <w:tab w:val="right" w:pos="8928"/>
-          <w:tab w:val="right" w:pos="11520"/>
-        </w:tabs>
-        <w:spacing w:after="80" w:line="228" w:lineRule="auto"/>
-        <w:rPr>
-          <w:rFonts w:ascii="Gill Sans MT" w:hAnsi="Gill Sans MT"/>
-          <w:b/>
-          <w:sz w:val="20"/>
-          <w:szCs w:val="20"/>
-        </w:rPr>
-      </w:pPr>
-      <w:r>
-        <w:rPr>
-          <w:rFonts w:ascii="Gill Sans MT" w:hAnsi="Gill Sans MT"/>
-          <w:b/>
-          <w:sz w:val="20"/>
-          <w:szCs w:val="20"/>
-        </w:rPr>
-        <w:t xml:space="preserve">Junior </w:t>
-      </w:r>
-      <w:r>
-        <w:rPr>
-          <w:rFonts w:ascii="Gill Sans MT" w:hAnsi="Gill Sans MT"/>
-          <w:b/>
-          <w:sz w:val="20"/>
-          <w:szCs w:val="20"/>
-        </w:rPr>
-        <w:t>Software Engineer</w:t>
-      </w:r>
-      <w:r>
-        <w:rPr>
-          <w:rFonts w:ascii="Gill Sans MT" w:hAnsi="Gill Sans MT"/>
-          <w:b/>
-          <w:sz w:val="20"/>
-          <w:szCs w:val="20"/>
-        </w:rPr>
-        <w:t xml:space="preserve"> </w:t>
-      </w:r>
-      <w:r>
-        <w:rPr>
-          <w:rFonts w:ascii="Gill Sans MT" w:hAnsi="Gill Sans MT"/>
-          <w:b/>
-          <w:sz w:val="20"/>
-          <w:szCs w:val="20"/>
-        </w:rPr>
-        <w:tab/>
-      </w:r>
-      <w:r>
-        <w:rPr>
-          <w:rFonts w:ascii="Gill Sans MT" w:hAnsi="Gill Sans MT"/>
-          <w:b/>
-          <w:sz w:val="20"/>
-          <w:szCs w:val="20"/>
-        </w:rPr>
-        <w:tab/>
-      </w:r>
-      <w:r>
-        <w:rPr>
-          <w:rFonts w:ascii="Gill Sans MT" w:hAnsi="Gill Sans MT"/>
-          <w:b/>
-          <w:sz w:val="20"/>
-          <w:szCs w:val="20"/>
-        </w:rPr>
-        <w:t>07/2013-03/2015</w:t>
+        <w:t>Refactored an Oracle PL/SQL EDI system, introducing decision tree-driven business logic.</w:t>
       </w:r>
     </w:p>
     <w:p>
@@ -2867,16 +3316,147 @@
         <w:spacing w:after="0" w:line="228" w:lineRule="auto"/>
         <w:rPr>
           <w:rFonts w:ascii="Gill Sans MT" w:hAnsi="Gill Sans MT"/>
-          <w:b/>
-        </w:rPr>
-      </w:pPr>
-      <w:r>
-        <w:rPr>
-          <w:rFonts w:ascii="Gill Sans MT" w:hAnsi="Gill Sans MT"/>
-          <w:sz w:val="20"/>
-          <w:szCs w:val="20"/>
-        </w:rPr>
-        <w:t>Developed a C# ASP.NET MVC3 tool for insurance agents to submit applications online, eliminating manual quote processing.</w:t>
+          <w:sz w:val="20"/>
+          <w:szCs w:val="20"/>
+        </w:rPr>
+      </w:pPr>
+      <w:r>
+        <w:rPr>
+          <w:rFonts w:ascii="Gill Sans MT" w:hAnsi="Gill Sans MT"/>
+          <w:sz w:val="20"/>
+          <w:szCs w:val="20"/>
+        </w:rPr>
+        <w:t>Automated a code production process, reducing task completion time from 6-8 weeks to 2-3 minutes.</w:t>
+      </w:r>
+    </w:p>
+    <w:p>
+      <w:pPr>
+        <w:spacing w:after="0" w:line="228" w:lineRule="auto"/>
+        <w:rPr>
+          <w:rFonts w:ascii="Gill Sans MT" w:hAnsi="Gill Sans MT"/>
+          <w:sz w:val="20"/>
+          <w:szCs w:val="20"/>
+        </w:rPr>
+      </w:pPr>
+    </w:p>
+    <w:p>
+      <w:pPr>
+        <w:tabs>
+          <w:tab w:val="right" w:pos="10800"/>
+        </w:tabs>
+        <w:spacing w:before="120" w:after="0" w:line="228" w:lineRule="auto"/>
+        <w:rPr>
+          <w:rFonts w:ascii="Gill Sans MT" w:hAnsi="Gill Sans MT"/>
+          <w:b/>
+          <w:sz w:val="20"/>
+          <w:szCs w:val="20"/>
+        </w:rPr>
+      </w:pPr>
+      <w:r>
+        <w:rPr>
+          <w:rFonts w:ascii="Gill Sans MT" w:hAnsi="Gill Sans MT"/>
+          <w:b/>
+          <w:sz w:val="20"/>
+          <w:szCs w:val="20"/>
+          <w:u w:val="single"/>
+        </w:rPr>
+        <w:t>Town &amp; Country Computer Services</w:t>
+      </w:r>
+      <w:r>
+        <w:rPr>
+          <w:rFonts w:ascii="Gill Sans MT" w:hAnsi="Gill Sans MT"/>
+          <w:sz w:val="20"/>
+          <w:szCs w:val="20"/>
+        </w:rPr>
+        <w:tab/>
+      </w:r>
+      <w:r>
+        <w:rPr>
+          <w:rFonts w:ascii="Gill Sans MT" w:hAnsi="Gill Sans MT"/>
+          <w:b/>
+          <w:sz w:val="20"/>
+          <w:szCs w:val="20"/>
+        </w:rPr>
+        <w:t>Schenectady</w:t>
+      </w:r>
+      <w:r>
+        <w:rPr>
+          <w:rFonts w:ascii="Gill Sans MT" w:hAnsi="Gill Sans MT"/>
+          <w:b/>
+          <w:sz w:val="20"/>
+          <w:szCs w:val="20"/>
+        </w:rPr>
+        <w:t>, NY</w:t>
+      </w:r>
+    </w:p>
+    <w:p>
+      <w:pPr>
+        <w:shd w:val="clear" w:color="auto" w:fill="F2F2F2" w:themeFill="background1" w:themeFillShade="F2"/>
+        <w:tabs>
+          <w:tab w:val="right" w:pos="8928"/>
+          <w:tab w:val="right" w:pos="11520"/>
+        </w:tabs>
+        <w:spacing w:after="80" w:line="228" w:lineRule="auto"/>
+        <w:rPr>
+          <w:rFonts w:ascii="Gill Sans MT" w:hAnsi="Gill Sans MT"/>
+          <w:b/>
+          <w:sz w:val="20"/>
+          <w:szCs w:val="20"/>
+        </w:rPr>
+      </w:pPr>
+      <w:r>
+        <w:rPr>
+          <w:rFonts w:ascii="Gill Sans MT" w:hAnsi="Gill Sans MT"/>
+          <w:b/>
+          <w:sz w:val="20"/>
+          <w:szCs w:val="20"/>
+        </w:rPr>
+        <w:t xml:space="preserve">Junior </w:t>
+      </w:r>
+      <w:r>
+        <w:rPr>
+          <w:rFonts w:ascii="Gill Sans MT" w:hAnsi="Gill Sans MT"/>
+          <w:b/>
+          <w:sz w:val="20"/>
+          <w:szCs w:val="20"/>
+        </w:rPr>
+        <w:t>Software Engineer</w:t>
+      </w:r>
+      <w:r>
+        <w:rPr>
+          <w:rFonts w:ascii="Gill Sans MT" w:hAnsi="Gill Sans MT"/>
+          <w:b/>
+          <w:sz w:val="20"/>
+          <w:szCs w:val="20"/>
+        </w:rPr>
+        <w:t xml:space="preserve"> </w:t>
+      </w:r>
+      <w:r>
+        <w:rPr>
+          <w:rFonts w:ascii="Gill Sans MT" w:hAnsi="Gill Sans MT"/>
+          <w:b/>
+          <w:sz w:val="20"/>
+          <w:szCs w:val="20"/>
+        </w:rPr>
+        <w:tab/>
+      </w:r>
+      <w:r>
+        <w:rPr>
+          <w:rFonts w:ascii="Gill Sans MT" w:hAnsi="Gill Sans MT"/>
+          <w:b/>
+          <w:sz w:val="20"/>
+          <w:szCs w:val="20"/>
+        </w:rPr>
+        <w:tab/>
+      </w:r>
+      <w:r>
+        <w:rPr>
+          <w:rFonts w:ascii="Gill Sans MT" w:hAnsi="Gill Sans MT"/>
+          <w:b/>
+          <w:sz w:val="20"/>
+          <w:szCs w:val="20"/>
+        </w:rPr>
+        <w:t>07/2013-03/2015</w:t>
       </w:r>
     </w:p>
     <w:p>
@@ -2898,7 +3478,7 @@
           <w:sz w:val="20"/>
           <w:szCs w:val="20"/>
         </w:rPr>
-        <w:t>Implemented a C# Web Service to automate insurance quote ratings, enabling agents to appraise homeowner policies from any device.</w:t>
+        <w:t>Developed a C# ASP.NET MVC3 tool for insurance agents to submit applications online, eliminating manual quote processing.</w:t>
       </w:r>
     </w:p>
     <w:p>
@@ -2920,8 +3500,38 @@
           <w:sz w:val="20"/>
           <w:szCs w:val="20"/>
         </w:rPr>
+        <w:t>Implemented a C# Web Service to automate insurance quote ratings, enabling agents to appraise homeowner policies from any device.</w:t>
+      </w:r>
+    </w:p>
+    <w:p>
+      <w:pPr>
+        <w:pStyle w:val="ListParagraph"/>
+        <w:numPr>
+          <w:ilvl w:val="0"/>
+          <w:numId w:val="3"/>
+        </w:numPr>
+        <w:spacing w:after="0" w:line="228" w:lineRule="auto"/>
+        <w:rPr>
+          <w:rFonts w:ascii="Gill Sans MT" w:hAnsi="Gill Sans MT"/>
+          <w:b/>
+        </w:rPr>
+      </w:pPr>
+      <w:r>
+        <w:rPr>
+          <w:rFonts w:ascii="Gill Sans MT" w:hAnsi="Gill Sans MT"/>
+          <w:sz w:val="20"/>
+          <w:szCs w:val="20"/>
+        </w:rPr>
         <w:t>Built a C# interface to automatically process reports on quote submissions, streamlining agent workflows.</w:t>
       </w:r>
+    </w:p>
+    <w:p>
+      <w:pPr>
+        <w:spacing w:after="0" w:line="276" w:lineRule="auto"/>
+        <w:rPr>
+          <w:rFonts w:ascii="Gill Sans MT" w:hAnsi="Gill Sans MT"/>
+        </w:rPr>
+      </w:pPr>
       <w:r>
         <w:rPr>
           <w:rFonts w:ascii="Gill Sans MT" w:hAnsi="Gill Sans MT"/>
@@ -2930,13 +3540,13 @@
         <mc:AlternateContent>
           <mc:Choice Requires="wps">
             <w:drawing>
-              <wp:anchor distT="0" distB="0" distL="114300" distR="114300" simplePos="0" relativeHeight="251665408" behindDoc="0" locked="0" layoutInCell="1" allowOverlap="1" wp14:anchorId="1CFABE1D" wp14:editId="0A053FEA">
+              <wp:anchor distT="0" distB="0" distL="114300" distR="114300" simplePos="0" relativeHeight="251665408" behindDoc="0" locked="0" layoutInCell="1" allowOverlap="1" wp14:anchorId="1CFABE1D" wp14:editId="77C1D5AA">
                 <wp:simplePos x="0" y="0"/>
                 <wp:positionH relativeFrom="column">
                   <wp:posOffset>-57150</wp:posOffset>
                 </wp:positionH>
                 <wp:positionV relativeFrom="paragraph">
-                  <wp:posOffset>73841</wp:posOffset>
+                  <wp:posOffset>108323</wp:posOffset>
                 </wp:positionV>
                 <wp:extent cx="6953250" cy="19050"/>
                 <wp:effectExtent l="0" t="0" r="19050" b="19050"/>
@@ -2988,7 +3598,11 @@
           </mc:Choice>
           <mc:Fallback>
             <w:pict>
-              <v:shape w14:anchorId="70BD97FC" id="Straight Arrow Connector 3" o:spid="_x0000_s1026" type="#_x0000_t32" style="position:absolute;margin-left:-4.5pt;margin-top:5.8pt;width:547.5pt;height:1.5pt;z-index:251665408;visibility:visible;mso-wrap-style:square;mso-width-percent:0;mso-height-percent:0;mso-wrap-distance-left:9pt;mso-wrap-distance-top:0;mso-wrap-distance-right:9pt;mso-wrap-distance-bottom:0;mso-position-horizontal:absolute;mso-position-horizontal-relative:text;mso-position-vertical:absolute;mso-position-vertical-relative:text;mso-width-percent:0;mso-height-percent:0;mso-width-relative:page;mso-height-relative:page" o:gfxdata="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">
+              <v:shapetype w14:anchorId="35ED5059" id="_x0000_t32" coordsize="21600,21600" o:spt="32" o:oned="t" path="m,l21600,21600e" filled="f">
+                <v:path arrowok="t" fillok="f" o:connecttype="none"/>
+                <o:lock v:ext="edit" shapetype="t"/>
+              </v:shapetype>
+              <v:shape id="Straight Arrow Connector 3" o:spid="_x0000_s1026" type="#_x0000_t32" style="position:absolute;margin-left:-4.5pt;margin-top:8.55pt;width:547.5pt;height:1.5pt;z-index:251665408;visibility:visible;mso-wrap-style:square;mso-width-percent:0;mso-height-percent:0;mso-wrap-distance-left:9pt;mso-wrap-distance-top:0;mso-wrap-distance-right:9pt;mso-wrap-distance-bottom:0;mso-position-horizontal:absolute;mso-position-horizontal-relative:text;mso-position-vertical:absolute;mso-position-vertical-relative:text;mso-width-percent:0;mso-height-percent:0;mso-width-relative:page;mso-height-relative:page" o:gfxdata="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">
                 <v:stroke dashstyle="1 1" endcap="round"/>
               </v:shape>
             </w:pict>
@@ -3003,14 +3617,6 @@
           <w:rFonts w:ascii="Gill Sans MT" w:hAnsi="Gill Sans MT"/>
         </w:rPr>
       </w:pPr>
-    </w:p>
-    <w:p>
-      <w:pPr>
-        <w:spacing w:after="0" w:line="276" w:lineRule="auto"/>
-        <w:rPr>
-          <w:rFonts w:ascii="Gill Sans MT" w:hAnsi="Gill Sans MT"/>
-        </w:rPr>
-      </w:pPr>
       <w:r>
         <w:rPr>
           <w:rFonts w:ascii="Gill Sans MT" w:hAnsi="Gill Sans MT"/>
@@ -3129,6 +3735,7 @@
         </w:rPr>
         <w:t xml:space="preserve">Certified ScrumMaster, </w:t>
       </w:r>
+      <w:proofErr w:type="spellStart"/>
       <w:r>
         <w:rPr>
           <w:rFonts w:ascii="Gill Sans MT" w:hAnsi="Gill Sans MT"/>
@@ -3137,6 +3744,7 @@
         </w:rPr>
         <w:t>ScrumAlliance</w:t>
       </w:r>
+      <w:proofErr w:type="spellEnd"/>
       <w:r>
         <w:rPr>
           <w:rFonts w:ascii="Gill Sans MT" w:hAnsi="Gill Sans MT"/>

</xml_diff>

<commit_message>
added tinycal link for scheduling
</commit_message>
<xml_diff>
--- a/adam-steinberger-resume.docx
+++ b/adam-steinberger-resume.docx
@@ -200,8 +200,19 @@
           <w:color w:val="auto"/>
           <w:u w:val="none"/>
         </w:rPr>
-        <w:t xml:space="preserve"> </w:t>
-      </w:r>
+        <w:t xml:space="preserve"> | ☕ </w:t>
+      </w:r>
+      <w:hyperlink r:id="rId8">
+        <w:r>
+          <w:rPr>
+            <w:rStyle w:val="Hyperlink"/>
+            <w:rFonts w:ascii="Ubuntu" w:hAnsi="Ubuntu"/>
+            <w:color w:val="auto"/>
+            <w:u w:val="none"/>
+          </w:rPr>
+          <w:t>@realadammatthew</w:t>
+        </w:r>
+      </w:hyperlink>
       <w:r>
         <w:rPr>
           <w:rStyle w:val="Hyperlink"/>
@@ -209,9 +220,18 @@
           <w:color w:val="auto"/>
           <w:u w:val="none"/>
         </w:rPr>
-        <w:t xml:space="preserve">| ☕ </w:t>
-      </w:r>
-      <w:hyperlink r:id="rId8">
+        <w:t xml:space="preserve"> </w:t>
+      </w:r>
+      <w:r>
+        <w:rPr>
+          <w:rStyle w:val="Hyperlink"/>
+          <w:rFonts w:ascii="Ubuntu" w:hAnsi="Ubuntu"/>
+          <w:color w:val="auto"/>
+          <w:u w:val="none"/>
+        </w:rPr>
+        <w:t xml:space="preserve">| 📅 </w:t>
+      </w:r>
+      <w:hyperlink r:id="rId9">
         <w:r>
           <w:rPr>
             <w:rStyle w:val="Hyperlink"/>
@@ -431,12 +451,12 @@
     <w:p>
       <w:pPr>
         <w:sectPr>
-          <w:headerReference w:type="even" r:id="rId9"/>
-          <w:headerReference w:type="default" r:id="rId10"/>
-          <w:headerReference w:type="first" r:id="rId11"/>
-          <w:footerReference w:type="even" r:id="rId12"/>
-          <w:footerReference w:type="default" r:id="rId13"/>
-          <w:footerReference w:type="first" r:id="rId14"/>
+          <w:headerReference w:type="even" r:id="rId10"/>
+          <w:headerReference w:type="default" r:id="rId11"/>
+          <w:headerReference w:type="first" r:id="rId12"/>
+          <w:footerReference w:type="even" r:id="rId13"/>
+          <w:footerReference w:type="default" r:id="rId14"/>
+          <w:footerReference w:type="first" r:id="rId15"/>
           <w:type w:val="nextPage"/>
           <w:pgSz w:w="12240" w:h="15840"/>
           <w:pgMar w:left="720" w:right="720" w:gutter="0" w:header="720" w:top="777" w:footer="720" w:bottom="777"/>

</xml_diff>